<commit_message>
Started work on chapter 5 and made markdown tweaks
</commit_message>
<xml_diff>
--- a/Content/Part 1/Chapter 1.docx
+++ b/Content/Part 1/Chapter 1.docx
@@ -1,18 +1,12 @@
 
 <file path=word/document.xml><?xml version="1.0" encoding="utf-8"?>
-<w:document xmlns:wpc="http://schemas.microsoft.com/office/word/2010/wordprocessingCanvas" xmlns:cx="http://schemas.microsoft.com/office/drawing/2014/chartex" xmlns:cx1="http://schemas.microsoft.com/office/drawing/2015/9/8/chartex" xmlns:cx2="http://schemas.microsoft.com/office/drawing/2015/10/21/chartex" xmlns:cx3="http://schemas.microsoft.com/office/drawing/2016/5/9/chartex" xmlns:cx4="http://schemas.microsoft.com/office/drawing/2016/5/10/chartex" xmlns:cx5="http://schemas.microsoft.com/office/drawing/2016/5/11/chartex" xmlns:cx6="http://schemas.microsoft.com/office/drawing/2016/5/12/chartex" xmlns:cx7="http://schemas.microsoft.com/office/drawing/2016/5/13/chartex" xmlns:cx8="http://schemas.microsoft.com/office/drawing/2016/5/14/chartex" xmlns:mc="http://schemas.openxmlformats.org/markup-compatibility/2006" xmlns:aink="http://schemas.microsoft.com/office/drawing/2016/ink" xmlns:am3d="http://schemas.microsoft.com/office/drawing/2017/model3d" xmlns:o="urn:schemas-microsoft-com:office:office" xmlns:r="http://schemas.openxmlformats.org/officeDocument/2006/relationships" xmlns:m="http://schemas.openxmlformats.org/officeDocument/2006/math" xmlns:v="urn:schemas-microsoft-com:vml" xmlns:wp14="http://schemas.microsoft.com/office/word/2010/wordprocessingDrawing" xmlns:wp="http://schemas.openxmlformats.org/drawingml/2006/wordprocessingDrawing" xmlns:w10="urn:schemas-microsoft-com:office:word" xmlns:w="http://schemas.openxmlformats.org/wordprocessingml/2006/main" xmlns:w14="http://schemas.microsoft.com/office/word/2010/wordml" xmlns:w15="http://schemas.microsoft.com/office/word/2012/wordml" xmlns:w16cex="http://schemas.microsoft.com/office/word/2018/wordml/cex" xmlns:w16cid="http://schemas.microsoft.com/office/word/2016/wordml/cid" xmlns:w16="http://schemas.microsoft.com/office/word/2018/wordml" xmlns:w16sdtdh="http://schemas.microsoft.com/office/word/2020/wordml/sdtdatahash" xmlns:w16se="http://schemas.microsoft.com/office/word/2015/wordml/symex" xmlns:wpg="http://schemas.microsoft.com/office/word/2010/wordprocessingGroup" xmlns:wpi="http://schemas.microsoft.com/office/word/2010/wordprocessingInk" xmlns:wne="http://schemas.microsoft.com/office/word/2006/wordml" xmlns:wps="http://schemas.microsoft.com/office/word/2010/wordprocessingShape" mc:Ignorable="w14 w15 w16se w16cid w16 w16cex w16sdtdh wp14">
+<w:document xmlns:wpc="http://schemas.microsoft.com/office/word/2010/wordprocessingCanvas" xmlns:cx="http://schemas.microsoft.com/office/drawing/2014/chartex" xmlns:cx1="http://schemas.microsoft.com/office/drawing/2015/9/8/chartex" xmlns:cx2="http://schemas.microsoft.com/office/drawing/2015/10/21/chartex" xmlns:cx3="http://schemas.microsoft.com/office/drawing/2016/5/9/chartex" xmlns:cx4="http://schemas.microsoft.com/office/drawing/2016/5/10/chartex" xmlns:cx5="http://schemas.microsoft.com/office/drawing/2016/5/11/chartex" xmlns:cx6="http://schemas.microsoft.com/office/drawing/2016/5/12/chartex" xmlns:cx7="http://schemas.microsoft.com/office/drawing/2016/5/13/chartex" xmlns:cx8="http://schemas.microsoft.com/office/drawing/2016/5/14/chartex" xmlns:mc="http://schemas.openxmlformats.org/markup-compatibility/2006" xmlns:aink="http://schemas.microsoft.com/office/drawing/2016/ink" xmlns:am3d="http://schemas.microsoft.com/office/drawing/2017/model3d" xmlns:o="urn:schemas-microsoft-com:office:office" xmlns:r="http://schemas.openxmlformats.org/officeDocument/2006/relationships" xmlns:m="http://schemas.openxmlformats.org/officeDocument/2006/math" xmlns:v="urn:schemas-microsoft-com:vml" xmlns:wp14="http://schemas.microsoft.com/office/word/2010/wordprocessingDrawing" xmlns:wp="http://schemas.openxmlformats.org/drawingml/2006/wordprocessingDrawing" xmlns:w10="urn:schemas-microsoft-com:office:word" xmlns:w="http://schemas.openxmlformats.org/wordprocessingml/2006/main" xmlns:w14="http://schemas.microsoft.com/office/word/2010/wordml" xmlns:w15="http://schemas.microsoft.com/office/word/2012/wordml" xmlns:w16cid="http://schemas.microsoft.com/office/word/2016/wordml/cid" xmlns:w16se="http://schemas.microsoft.com/office/word/2015/wordml/symex" xmlns:wpg="http://schemas.microsoft.com/office/word/2010/wordprocessingGroup" xmlns:wpi="http://schemas.microsoft.com/office/word/2010/wordprocessingInk" xmlns:wne="http://schemas.microsoft.com/office/word/2006/wordml" xmlns:wps="http://schemas.microsoft.com/office/word/2010/wordprocessingShape" mc:Ignorable="w14 w15 w16se w16cid wp14">
   <w:body>
     <w:p>
       <w:pPr>
-        <w:pStyle w:val="1"/>
-        <w:rPr>
-          <w:sz w:val="52"/>
-        </w:rPr>
-      </w:pPr>
-      <w:r>
-        <w:rPr>
-          <w:sz w:val="52"/>
-        </w:rPr>
+        <w:pStyle w:val="Title"/>
+      </w:pPr>
+      <w:r>
         <w:t>Part I — Foundations and Platform Strategy</w:t>
       </w:r>
     </w:p>
@@ -38,106 +32,20 @@
           <w:sz w:val="52"/>
           <w:szCs w:val="48"/>
         </w:rPr>
-        <w:t>1.1 What Is AI Platform Engineering?</w:t>
+        <w:t>Chapter 1. Scope, Evidence, and Technology Landscape</w:t>
       </w:r>
     </w:p>
     <w:p>
       <w:pPr>
         <w:spacing w:before="100" w:beforeAutospacing="1" w:after="100" w:afterAutospacing="1" w:line="240" w:lineRule="auto"/>
-        <w:rPr>
-          <w:rFonts w:ascii="Times New Roman" w:eastAsia="Times New Roman" w:hAnsi="Times New Roman" w:cs="Times New Roman"/>
-          <w:sz w:val="28"/>
-          <w:szCs w:val="24"/>
-        </w:rPr>
-      </w:pPr>
-      <w:r>
-        <w:rPr>
-          <w:rFonts w:ascii="Times New Roman" w:eastAsia="Times New Roman" w:hAnsi="Times New Roman" w:cs="Times New Roman"/>
-          <w:sz w:val="28"/>
-          <w:szCs w:val="24"/>
-        </w:rPr>
-        <w:t>Artificial intelligence has become an increasingly important component of modern software systems, but the engineering challenges associated with deploying AI capabilities differ significantly from those of developing machine learning models. In many organizations, the primary technical challenge is no longer designing neural network architectures or training foundation models. Instead, engineering effort is concentrated on integrating, operating, securing, scaling, and governing AI capabilities within production software systems.</w:t>
-      </w:r>
-    </w:p>
-    <w:p>
-      <w:pPr>
-        <w:spacing w:before="100" w:beforeAutospacing="1" w:after="100" w:afterAutospacing="1" w:line="240" w:lineRule="auto"/>
-        <w:rPr>
-          <w:rFonts w:ascii="Times New Roman" w:eastAsia="Times New Roman" w:hAnsi="Times New Roman" w:cs="Times New Roman"/>
-          <w:sz w:val="28"/>
-          <w:szCs w:val="24"/>
-        </w:rPr>
-      </w:pPr>
-      <w:r>
-        <w:rPr>
-          <w:rFonts w:ascii="Times New Roman" w:eastAsia="Times New Roman" w:hAnsi="Times New Roman" w:cs="Times New Roman"/>
-          <w:sz w:val="28"/>
-          <w:szCs w:val="24"/>
-        </w:rPr>
-        <w:t xml:space="preserve">This shift has given rise to what is increasingly referred to as </w:t>
-      </w:r>
-      <w:r>
+        <w:outlineLvl w:val="0"/>
         <w:rPr>
           <w:rFonts w:ascii="Times New Roman" w:eastAsia="Times New Roman" w:hAnsi="Times New Roman" w:cs="Times New Roman"/>
           <w:b/>
           <w:bCs/>
-          <w:sz w:val="28"/>
-          <w:szCs w:val="24"/>
-        </w:rPr>
-        <w:t>AI Platform Engineering</w:t>
-      </w:r>
-      <w:r>
-        <w:rPr>
-          <w:rFonts w:ascii="Times New Roman" w:eastAsia="Times New Roman" w:hAnsi="Times New Roman" w:cs="Times New Roman"/>
-          <w:sz w:val="28"/>
-          <w:szCs w:val="24"/>
-        </w:rPr>
-        <w:t xml:space="preserve">. Although the term does not yet have a universally accepted formal definition, industry practice has converged on a common interpretation. AI Platform Engineering concerns the design, implementation, and operation of the infrastructure, services, workflows, and governance mechanisms that enable multiple AI-powered applications to be developed and operated consistently at production scale. Recent developments in the cloud-native ecosystem—including the formation of dedicated Kubernetes working groups for AI networking and inference infrastructure—illustrate that the industry increasingly recognizes AI infrastructure as a distinct systems engineering domain rather than merely another application workload. </w:t>
-      </w:r>
-    </w:p>
-    <w:p>
-      <w:pPr>
-        <w:spacing w:before="100" w:beforeAutospacing="1" w:after="100" w:afterAutospacing="1" w:line="240" w:lineRule="auto"/>
-        <w:rPr>
-          <w:rFonts w:ascii="Times New Roman" w:eastAsia="Times New Roman" w:hAnsi="Times New Roman" w:cs="Times New Roman"/>
-          <w:sz w:val="28"/>
-          <w:szCs w:val="24"/>
-        </w:rPr>
-      </w:pPr>
-      <w:r>
-        <w:rPr>
-          <w:rFonts w:ascii="Times New Roman" w:eastAsia="Times New Roman" w:hAnsi="Times New Roman" w:cs="Times New Roman"/>
-          <w:sz w:val="28"/>
-          <w:szCs w:val="24"/>
-        </w:rPr>
-        <w:t>Unlike traditional machine learning platforms, which were primarily optimized around data preparation, model training, and experiment management, modern AI platforms are predominantly inference-oriented. Most organizations consume pre-trained foundation models through commercial APIs or deploy open-weight models internally, shifting engineering priorities toward inference latency, routing, reliability, security, governance, cost management, and operational lifecycle management.</w:t>
-      </w:r>
-    </w:p>
-    <w:p>
-      <w:pPr>
-        <w:spacing w:before="100" w:beforeAutospacing="1" w:after="100" w:afterAutospacing="1" w:line="240" w:lineRule="auto"/>
-        <w:rPr>
-          <w:rFonts w:ascii="Times New Roman" w:eastAsia="Times New Roman" w:hAnsi="Times New Roman" w:cs="Times New Roman"/>
-          <w:sz w:val="28"/>
-          <w:szCs w:val="24"/>
-        </w:rPr>
-      </w:pPr>
-      <w:r>
-        <w:rPr>
-          <w:rFonts w:ascii="Times New Roman" w:eastAsia="Times New Roman" w:hAnsi="Times New Roman" w:cs="Times New Roman"/>
-          <w:sz w:val="28"/>
-          <w:szCs w:val="24"/>
-        </w:rPr>
-        <w:t>Consequently, AI Platform Engineering should be viewed as an evolution of several established engineering disciplines rather than as an entirely new field.</w:t>
-      </w:r>
-    </w:p>
-    <w:p>
-      <w:pPr>
-        <w:spacing w:before="100" w:beforeAutospacing="1" w:after="100" w:afterAutospacing="1" w:line="240" w:lineRule="auto"/>
-        <w:rPr>
-          <w:rFonts w:ascii="Times New Roman" w:eastAsia="Times New Roman" w:hAnsi="Times New Roman" w:cs="Times New Roman"/>
-          <w:sz w:val="28"/>
-          <w:szCs w:val="24"/>
+          <w:kern w:val="36"/>
+          <w:sz w:val="52"/>
+          <w:szCs w:val="48"/>
         </w:rPr>
       </w:pPr>
       <w:r>
@@ -145,9 +53,149 @@
           <w:rFonts w:ascii="Times New Roman" w:eastAsia="Times New Roman" w:hAnsi="Times New Roman" w:cs="Times New Roman"/>
           <w:b/>
           <w:bCs/>
-          <w:sz w:val="28"/>
-          <w:szCs w:val="24"/>
-        </w:rPr>
+          <w:kern w:val="36"/>
+          <w:sz w:val="52"/>
+          <w:szCs w:val="48"/>
+        </w:rPr>
+        <w:t>1.1 What Is AI Platform Engineering?</w:t>
+      </w:r>
+    </w:p>
+    <w:p>
+      <w:pPr>
+        <w:spacing w:before="100" w:beforeAutospacing="1" w:after="100" w:afterAutospacing="1" w:line="240" w:lineRule="auto"/>
+        <w:rPr>
+          <w:rFonts w:ascii="Times New Roman" w:eastAsia="Times New Roman" w:hAnsi="Times New Roman" w:cs="Times New Roman"/>
+          <w:sz w:val="28"/>
+          <w:szCs w:val="24"/>
+        </w:rPr>
+      </w:pPr>
+      <w:r>
+        <w:rPr>
+          <w:rFonts w:ascii="Times New Roman" w:eastAsia="Times New Roman" w:hAnsi="Times New Roman" w:cs="Times New Roman"/>
+          <w:sz w:val="28"/>
+          <w:szCs w:val="24"/>
+        </w:rPr>
+        <w:t>Artificial intelligence has become an increasingly important component of modern software systems, but the engineering challenges associated with deploying AI capabilities differ significan</w:t>
+      </w:r>
+      <w:bookmarkStart w:id="0" w:name="_GoBack"/>
+      <w:bookmarkEnd w:id="0"/>
+      <w:r>
+        <w:rPr>
+          <w:rFonts w:ascii="Times New Roman" w:eastAsia="Times New Roman" w:hAnsi="Times New Roman" w:cs="Times New Roman"/>
+          <w:sz w:val="28"/>
+          <w:szCs w:val="24"/>
+        </w:rPr>
+        <w:t>tly from those of developing machine learning models. In many organizations, the primary technical challenge is no longer designing neural network architectures or training foundation models. Instead, engineering effort is concentrated on integrating, operating, securing, scaling, and governing AI capabilities within production software systems.</w:t>
+      </w:r>
+    </w:p>
+    <w:p>
+      <w:pPr>
+        <w:spacing w:before="100" w:beforeAutospacing="1" w:after="100" w:afterAutospacing="1" w:line="240" w:lineRule="auto"/>
+        <w:rPr>
+          <w:rFonts w:ascii="Times New Roman" w:eastAsia="Times New Roman" w:hAnsi="Times New Roman" w:cs="Times New Roman"/>
+          <w:sz w:val="28"/>
+          <w:szCs w:val="24"/>
+        </w:rPr>
+      </w:pPr>
+      <w:r>
+        <w:rPr>
+          <w:rFonts w:ascii="Times New Roman" w:eastAsia="Times New Roman" w:hAnsi="Times New Roman" w:cs="Times New Roman"/>
+          <w:sz w:val="28"/>
+          <w:szCs w:val="24"/>
+        </w:rPr>
+        <w:t xml:space="preserve">This shift has given rise to what is increasingly referred to as </w:t>
+      </w:r>
+      <w:r>
+        <w:rPr>
+          <w:rFonts w:ascii="Times New Roman" w:eastAsia="Times New Roman" w:hAnsi="Times New Roman" w:cs="Times New Roman"/>
+          <w:b/>
+          <w:bCs/>
+          <w:sz w:val="28"/>
+          <w:szCs w:val="24"/>
+        </w:rPr>
+        <w:t>AI Platform Engineering</w:t>
+      </w:r>
+      <w:r>
+        <w:rPr>
+          <w:rFonts w:ascii="Times New Roman" w:eastAsia="Times New Roman" w:hAnsi="Times New Roman" w:cs="Times New Roman"/>
+          <w:sz w:val="28"/>
+          <w:szCs w:val="24"/>
+        </w:rPr>
+        <w:t xml:space="preserve">. Although the term does not yet have a universally accepted formal definition, industry practice has converged on a common interpretation. AI Platform Engineering concerns the design, implementation, and operation of the infrastructure, services, workflows, and governance mechanisms that enable multiple AI-powered applications to be developed and operated consistently at production scale. Recent developments in the cloud-native ecosystem—including the formation of dedicated Kubernetes working groups for AI networking and inference infrastructure—illustrate that the industry increasingly recognizes AI infrastructure as a </w:t>
+      </w:r>
+      <w:proofErr w:type="gramStart"/>
+      <w:r>
+        <w:rPr>
+          <w:rFonts w:ascii="Times New Roman" w:eastAsia="Times New Roman" w:hAnsi="Times New Roman" w:cs="Times New Roman"/>
+          <w:sz w:val="28"/>
+          <w:szCs w:val="24"/>
+        </w:rPr>
+        <w:t>distinct systems</w:t>
+      </w:r>
+      <w:proofErr w:type="gramEnd"/>
+      <w:r>
+        <w:rPr>
+          <w:rFonts w:ascii="Times New Roman" w:eastAsia="Times New Roman" w:hAnsi="Times New Roman" w:cs="Times New Roman"/>
+          <w:sz w:val="28"/>
+          <w:szCs w:val="24"/>
+        </w:rPr>
+        <w:t xml:space="preserve"> engineering domain rather than merely another application workload. </w:t>
+      </w:r>
+    </w:p>
+    <w:p>
+      <w:pPr>
+        <w:spacing w:before="100" w:beforeAutospacing="1" w:after="100" w:afterAutospacing="1" w:line="240" w:lineRule="auto"/>
+        <w:rPr>
+          <w:rFonts w:ascii="Times New Roman" w:eastAsia="Times New Roman" w:hAnsi="Times New Roman" w:cs="Times New Roman"/>
+          <w:sz w:val="28"/>
+          <w:szCs w:val="24"/>
+        </w:rPr>
+      </w:pPr>
+      <w:r>
+        <w:rPr>
+          <w:rFonts w:ascii="Times New Roman" w:eastAsia="Times New Roman" w:hAnsi="Times New Roman" w:cs="Times New Roman"/>
+          <w:sz w:val="28"/>
+          <w:szCs w:val="24"/>
+        </w:rPr>
+        <w:t>Unlike traditional machine learning platforms, which were primarily optimized around data preparation, model training, and experiment management, modern AI platforms are predominantly inference-oriented. Most organizations consume pre-trained foundation models through commercial APIs or deploy open-weight models internally, shifting engineering priorities toward inference latency, routing, reliability, security, governance, cost management, and operational lifecycle management.</w:t>
+      </w:r>
+    </w:p>
+    <w:p>
+      <w:pPr>
+        <w:spacing w:before="100" w:beforeAutospacing="1" w:after="100" w:afterAutospacing="1" w:line="240" w:lineRule="auto"/>
+        <w:rPr>
+          <w:rFonts w:ascii="Times New Roman" w:eastAsia="Times New Roman" w:hAnsi="Times New Roman" w:cs="Times New Roman"/>
+          <w:sz w:val="28"/>
+          <w:szCs w:val="24"/>
+        </w:rPr>
+      </w:pPr>
+      <w:r>
+        <w:rPr>
+          <w:rFonts w:ascii="Times New Roman" w:eastAsia="Times New Roman" w:hAnsi="Times New Roman" w:cs="Times New Roman"/>
+          <w:sz w:val="28"/>
+          <w:szCs w:val="24"/>
+        </w:rPr>
+        <w:t>Consequently, AI Platform Engineering should be viewed as an evolution of several established engineering disciplines rather than as an entirely new field.</w:t>
+      </w:r>
+    </w:p>
+    <w:p>
+      <w:pPr>
+        <w:spacing w:before="100" w:beforeAutospacing="1" w:after="100" w:afterAutospacing="1" w:line="240" w:lineRule="auto"/>
+        <w:rPr>
+          <w:rFonts w:ascii="Times New Roman" w:eastAsia="Times New Roman" w:hAnsi="Times New Roman" w:cs="Times New Roman"/>
+          <w:sz w:val="28"/>
+          <w:szCs w:val="24"/>
+        </w:rPr>
+      </w:pPr>
+      <w:r>
+        <w:rPr>
+          <w:rFonts w:ascii="Times New Roman" w:eastAsia="Times New Roman" w:hAnsi="Times New Roman" w:cs="Times New Roman"/>
+          <w:b/>
+          <w:bCs/>
+          <w:sz w:val="28"/>
+          <w:szCs w:val="24"/>
+        </w:rPr>
+        <w:lastRenderedPageBreak/>
         <w:t>Table 1-1. Relationship Between Engineering Disciplines and AI Platform Engineering</w:t>
       </w:r>
     </w:p>
@@ -201,7 +249,6 @@
                 <w:bCs/>
                 <w:sz w:val="24"/>
               </w:rPr>
-              <w:lastRenderedPageBreak/>
               <w:t>Discipline</w:t>
             </w:r>
           </w:p>
@@ -697,6 +744,7 @@
                 <w:sz w:val="24"/>
               </w:rPr>
             </w:pPr>
+            <w:proofErr w:type="spellStart"/>
             <w:r>
               <w:rPr>
                 <w:rFonts w:ascii="Times New Roman" w:eastAsia="Times New Roman" w:hAnsi="Times New Roman" w:cs="Times New Roman"/>
@@ -704,6 +752,7 @@
               </w:rPr>
               <w:t>DevSecOps</w:t>
             </w:r>
+            <w:proofErr w:type="spellEnd"/>
           </w:p>
         </w:tc>
         <w:tc>
@@ -771,7 +820,23 @@
                 <w:rFonts w:ascii="Times New Roman" w:eastAsia="Times New Roman" w:hAnsi="Times New Roman" w:cs="Times New Roman"/>
                 <w:sz w:val="24"/>
               </w:rPr>
-              <w:t>AI platforms extend DevSecOps to include model governance, prompt security, supply-chain integrity, and AI policy enforcement.</w:t>
+              <w:t xml:space="preserve">AI platforms extend </w:t>
+            </w:r>
+            <w:proofErr w:type="spellStart"/>
+            <w:r>
+              <w:rPr>
+                <w:rFonts w:ascii="Times New Roman" w:eastAsia="Times New Roman" w:hAnsi="Times New Roman" w:cs="Times New Roman"/>
+                <w:sz w:val="24"/>
+              </w:rPr>
+              <w:t>DevSecOps</w:t>
+            </w:r>
+            <w:proofErr w:type="spellEnd"/>
+            <w:r>
+              <w:rPr>
+                <w:rFonts w:ascii="Times New Roman" w:eastAsia="Times New Roman" w:hAnsi="Times New Roman" w:cs="Times New Roman"/>
+                <w:sz w:val="24"/>
+              </w:rPr>
+              <w:t xml:space="preserve"> to include model governance, prompt security, supply-chain integrity, and AI policy enforcement.</w:t>
             </w:r>
           </w:p>
         </w:tc>
@@ -891,6 +956,7 @@
                 <w:sz w:val="24"/>
               </w:rPr>
             </w:pPr>
+            <w:proofErr w:type="spellStart"/>
             <w:r>
               <w:rPr>
                 <w:rFonts w:ascii="Times New Roman" w:eastAsia="Times New Roman" w:hAnsi="Times New Roman" w:cs="Times New Roman"/>
@@ -898,6 +964,7 @@
               </w:rPr>
               <w:t>MLOps</w:t>
             </w:r>
+            <w:proofErr w:type="spellEnd"/>
           </w:p>
         </w:tc>
         <w:tc>
@@ -965,7 +1032,23 @@
                 <w:rFonts w:ascii="Times New Roman" w:eastAsia="Times New Roman" w:hAnsi="Times New Roman" w:cs="Times New Roman"/>
                 <w:sz w:val="24"/>
               </w:rPr>
-              <w:t>AI Platform Engineering incorporates MLOps where organizations train models, but increasingly emphasizes inference operations over training workflows.</w:t>
+              <w:t xml:space="preserve">AI Platform Engineering incorporates </w:t>
+            </w:r>
+            <w:proofErr w:type="spellStart"/>
+            <w:r>
+              <w:rPr>
+                <w:rFonts w:ascii="Times New Roman" w:eastAsia="Times New Roman" w:hAnsi="Times New Roman" w:cs="Times New Roman"/>
+                <w:sz w:val="24"/>
+              </w:rPr>
+              <w:t>MLOps</w:t>
+            </w:r>
+            <w:proofErr w:type="spellEnd"/>
+            <w:r>
+              <w:rPr>
+                <w:rFonts w:ascii="Times New Roman" w:eastAsia="Times New Roman" w:hAnsi="Times New Roman" w:cs="Times New Roman"/>
+                <w:sz w:val="24"/>
+              </w:rPr>
+              <w:t xml:space="preserve"> where organizations train models, but increasingly emphasizes inference operations over training workflows.</w:t>
             </w:r>
           </w:p>
         </w:tc>
@@ -986,7 +1069,7 @@
           <w:sz w:val="28"/>
           <w:szCs w:val="24"/>
         </w:rPr>
-        <w:t xml:space="preserve">One characteristic distinguishes AI Platform Engineering from most previous infrastructure domains: the underlying model often belongs to another organization. Production systems routinely invoke commercial APIs, deploy community-developed open-weight models, or combine multiple providers within a single application. Consequently, engineering teams must design platforms </w:t>
+        <w:t xml:space="preserve">One characteristic distinguishes AI Platform Engineering from most previous infrastructure domains: the underlying model often belongs to another </w:t>
       </w:r>
       <w:r>
         <w:rPr>
@@ -995,7 +1078,7 @@
           <w:szCs w:val="24"/>
         </w:rPr>
         <w:lastRenderedPageBreak/>
-        <w:t>capable of accommodating rapidly changing models without requiring equivalent changes to surrounding business systems.</w:t>
+        <w:t>organization. Production systems routinely invoke commercial APIs, deploy community-developed open-weight models, or combine multiple providers within a single application. Consequently, engineering teams must design platforms capable of accommodating rapidly changing models without requiring equivalent changes to surrounding business systems.</w:t>
       </w:r>
     </w:p>
     <w:p>
@@ -1130,16 +1213,8 @@
           <w:sz w:val="28"/>
           <w:szCs w:val="24"/>
         </w:rPr>
-        <w:t xml:space="preserve">The publication of the Transformer architecture in 2017 fundamentally altered this trajectory by demonstrating a highly scalable architecture for sequence modeling. Subsequent scaling of transformer-based language models culminated in the emergence of foundation models capable of performing a wide range of </w:t>
-      </w:r>
-      <w:r>
-        <w:rPr>
-          <w:rFonts w:ascii="Times New Roman" w:eastAsia="Times New Roman" w:hAnsi="Times New Roman" w:cs="Times New Roman"/>
-          <w:sz w:val="28"/>
-          <w:szCs w:val="24"/>
-        </w:rPr>
         <w:lastRenderedPageBreak/>
-        <w:t>downstream tasks without task-specific retraining. As these models grew larger, organizations increasingly shifted from training their own models to consuming externally developed foundation models through APIs or deploying open-weight models optimized for inference.</w:t>
+        <w:t>The publication of the Transformer architecture in 2017 fundamentally altered this trajectory by demonstrating a highly scalable architecture for sequence modeling. Subsequent scaling of transformer-based language models culminated in the emergence of foundation models capable of performing a wide range of downstream tasks without task-specific retraining. As these models grew larger, organizations increasingly shifted from training their own models to consuming externally developed foundation models through APIs or deploying open-weight models optimized for inference.</w:t>
       </w:r>
     </w:p>
     <w:p>
@@ -1874,16 +1949,8 @@
           <w:sz w:val="28"/>
           <w:szCs w:val="24"/>
         </w:rPr>
-        <w:t xml:space="preserve">Commercial providers demonstrated that organizations were willing to outsource foundation model development while maintaining ownership of application logic and enterprise data. Open-weight models simultaneously lowered barriers to self-hosted inference. Improvements in quantization, optimized inference engines, and </w:t>
-      </w:r>
-      <w:r>
-        <w:rPr>
-          <w:rFonts w:ascii="Times New Roman" w:eastAsia="Times New Roman" w:hAnsi="Times New Roman" w:cs="Times New Roman"/>
-          <w:sz w:val="28"/>
-          <w:szCs w:val="24"/>
-        </w:rPr>
         <w:lastRenderedPageBreak/>
-        <w:t>specialized GPU scheduling made deploying increasingly capable models economically feasible for organizations that preferred greater control over latency, privacy, or regulatory compliance.</w:t>
+        <w:t>Commercial providers demonstrated that organizations were willing to outsource foundation model development while maintaining ownership of application logic and enterprise data. Open-weight models simultaneously lowered barriers to self-hosted inference. Improvements in quantization, optimized inference engines, and specialized GPU scheduling made deploying increasingly capable models economically feasible for organizations that preferred greater control over latency, privacy, or regulatory compliance.</w:t>
       </w:r>
     </w:p>
     <w:p>
@@ -2036,6 +2103,7 @@
           <w:sz w:val="28"/>
           <w:szCs w:val="24"/>
         </w:rPr>
+        <w:lastRenderedPageBreak/>
         <w:t>The foundation model itself is therefore only one component within a considerably larger system.</w:t>
       </w:r>
     </w:p>
@@ -2054,7 +2122,6 @@
           <w:sz w:val="28"/>
           <w:szCs w:val="24"/>
         </w:rPr>
-        <w:lastRenderedPageBreak/>
         <w:t>A production AI platform typically consists of several architectural layers, each responsible for a distinct aspect of system behavior. Although implementations differ across organizations, these layers appear with remarkable consistency across commercial cloud platforms and self-hosted deployments.</w:t>
       </w:r>
     </w:p>
@@ -2930,7 +2997,7 @@
           <w:sz w:val="28"/>
           <w:szCs w:val="24"/>
         </w:rPr>
-        <w:t xml:space="preserve">One of the most common misconceptions surrounding AI systems is that model quality alone determines production success. In practice, successful production deployments depend at least as much on the surrounding infrastructure as on the model itself. Authentication, routing, retries, caching, network reliability, storage systems, governance policies, deployment automation, and operational visibility </w:t>
+        <w:t xml:space="preserve">One of the most common misconceptions surrounding AI systems is that model quality alone determines production success. In practice, successful production deployments depend at least as much on the surrounding infrastructure as on the </w:t>
       </w:r>
       <w:r>
         <w:rPr>
@@ -2939,7 +3006,7 @@
           <w:szCs w:val="24"/>
         </w:rPr>
         <w:lastRenderedPageBreak/>
-        <w:t>often determine whether an AI capability can be operated safely and economically at scale.</w:t>
+        <w:t>model itself. Authentication, routing, retries, caching, network reliability, storage systems, governance policies, deployment automation, and operational visibility often determine whether an AI capability can be operated safely and economically at scale.</w:t>
       </w:r>
     </w:p>
     <w:p>
@@ -3054,16 +3121,8 @@
           <w:sz w:val="28"/>
           <w:szCs w:val="24"/>
         </w:rPr>
-        <w:t xml:space="preserve">For engineers entering the field, the sheer number of available technologies can be overwhelming. New models appear weekly, inference engines evolve rapidly, orchestration frameworks compete to define emerging programming abstractions, </w:t>
-      </w:r>
-      <w:r>
-        <w:rPr>
-          <w:rFonts w:ascii="Times New Roman" w:eastAsia="Times New Roman" w:hAnsi="Times New Roman" w:cs="Times New Roman"/>
-          <w:sz w:val="28"/>
-          <w:szCs w:val="24"/>
-        </w:rPr>
         <w:lastRenderedPageBreak/>
-        <w:t>and cloud providers continuously expand managed AI offerings. The resulting landscape can appear fragmented and unstable.</w:t>
+        <w:t>For engineers entering the field, the sheer number of available technologies can be overwhelming. New models appear weekly, inference engines evolve rapidly, orchestration frameworks compete to define emerging programming abstractions, and cloud providers continuously expand managed AI offerings. The resulting landscape can appear fragmented and unstable.</w:t>
       </w:r>
     </w:p>
     <w:p>
@@ -3325,12 +3384,21 @@
                 <w:sz w:val="24"/>
               </w:rPr>
             </w:pPr>
-            <w:r>
-              <w:rPr>
-                <w:rFonts w:ascii="Times New Roman" w:eastAsia="Times New Roman" w:hAnsi="Times New Roman" w:cs="Times New Roman"/>
-                <w:sz w:val="24"/>
-              </w:rPr>
-              <w:t>OpenAI, Anthropic, Google Gemini, Azure AI Foundry, Amazon Bedrock, Cohere</w:t>
+            <w:proofErr w:type="spellStart"/>
+            <w:r>
+              <w:rPr>
+                <w:rFonts w:ascii="Times New Roman" w:eastAsia="Times New Roman" w:hAnsi="Times New Roman" w:cs="Times New Roman"/>
+                <w:sz w:val="24"/>
+              </w:rPr>
+              <w:t>OpenAI</w:t>
+            </w:r>
+            <w:proofErr w:type="spellEnd"/>
+            <w:r>
+              <w:rPr>
+                <w:rFonts w:ascii="Times New Roman" w:eastAsia="Times New Roman" w:hAnsi="Times New Roman" w:cs="Times New Roman"/>
+                <w:sz w:val="24"/>
+              </w:rPr>
+              <w:t>, Anthropic, Google Gemini, Azure AI Foundry, Amazon Bedrock, Cohere</w:t>
             </w:r>
           </w:p>
         </w:tc>
@@ -3427,7 +3495,39 @@
                 <w:rFonts w:ascii="Times New Roman" w:eastAsia="Times New Roman" w:hAnsi="Times New Roman" w:cs="Times New Roman"/>
                 <w:sz w:val="24"/>
               </w:rPr>
-              <w:t>Llama, Mistral, Gemma, Qwen, DeepSeek, Granite</w:t>
+              <w:t xml:space="preserve">Llama, Mistral, Gemma, </w:t>
+            </w:r>
+            <w:proofErr w:type="spellStart"/>
+            <w:r>
+              <w:rPr>
+                <w:rFonts w:ascii="Times New Roman" w:eastAsia="Times New Roman" w:hAnsi="Times New Roman" w:cs="Times New Roman"/>
+                <w:sz w:val="24"/>
+              </w:rPr>
+              <w:t>Qwen</w:t>
+            </w:r>
+            <w:proofErr w:type="spellEnd"/>
+            <w:r>
+              <w:rPr>
+                <w:rFonts w:ascii="Times New Roman" w:eastAsia="Times New Roman" w:hAnsi="Times New Roman" w:cs="Times New Roman"/>
+                <w:sz w:val="24"/>
+              </w:rPr>
+              <w:t xml:space="preserve">, </w:t>
+            </w:r>
+            <w:proofErr w:type="spellStart"/>
+            <w:r>
+              <w:rPr>
+                <w:rFonts w:ascii="Times New Roman" w:eastAsia="Times New Roman" w:hAnsi="Times New Roman" w:cs="Times New Roman"/>
+                <w:sz w:val="24"/>
+              </w:rPr>
+              <w:t>DeepSeek</w:t>
+            </w:r>
+            <w:proofErr w:type="spellEnd"/>
+            <w:r>
+              <w:rPr>
+                <w:rFonts w:ascii="Times New Roman" w:eastAsia="Times New Roman" w:hAnsi="Times New Roman" w:cs="Times New Roman"/>
+                <w:sz w:val="24"/>
+              </w:rPr>
+              <w:t>, Granite</w:t>
             </w:r>
           </w:p>
         </w:tc>
@@ -3519,13 +3619,63 @@
                 <w:sz w:val="24"/>
               </w:rPr>
             </w:pPr>
-            <w:r>
-              <w:rPr>
-                <w:rFonts w:ascii="Times New Roman" w:eastAsia="Times New Roman" w:hAnsi="Times New Roman" w:cs="Times New Roman"/>
-                <w:sz w:val="24"/>
-              </w:rPr>
-              <w:t>vLLM, TensorRT-LLM, SGLang, llama.cpp, Ollama</w:t>
-            </w:r>
+            <w:proofErr w:type="spellStart"/>
+            <w:r>
+              <w:rPr>
+                <w:rFonts w:ascii="Times New Roman" w:eastAsia="Times New Roman" w:hAnsi="Times New Roman" w:cs="Times New Roman"/>
+                <w:sz w:val="24"/>
+              </w:rPr>
+              <w:t>vLLM</w:t>
+            </w:r>
+            <w:proofErr w:type="spellEnd"/>
+            <w:r>
+              <w:rPr>
+                <w:rFonts w:ascii="Times New Roman" w:eastAsia="Times New Roman" w:hAnsi="Times New Roman" w:cs="Times New Roman"/>
+                <w:sz w:val="24"/>
+              </w:rPr>
+              <w:t xml:space="preserve">, </w:t>
+            </w:r>
+            <w:proofErr w:type="spellStart"/>
+            <w:r>
+              <w:rPr>
+                <w:rFonts w:ascii="Times New Roman" w:eastAsia="Times New Roman" w:hAnsi="Times New Roman" w:cs="Times New Roman"/>
+                <w:sz w:val="24"/>
+              </w:rPr>
+              <w:t>TensorRT</w:t>
+            </w:r>
+            <w:proofErr w:type="spellEnd"/>
+            <w:r>
+              <w:rPr>
+                <w:rFonts w:ascii="Times New Roman" w:eastAsia="Times New Roman" w:hAnsi="Times New Roman" w:cs="Times New Roman"/>
+                <w:sz w:val="24"/>
+              </w:rPr>
+              <w:t xml:space="preserve">-LLM, </w:t>
+            </w:r>
+            <w:proofErr w:type="spellStart"/>
+            <w:r>
+              <w:rPr>
+                <w:rFonts w:ascii="Times New Roman" w:eastAsia="Times New Roman" w:hAnsi="Times New Roman" w:cs="Times New Roman"/>
+                <w:sz w:val="24"/>
+              </w:rPr>
+              <w:t>SGLang</w:t>
+            </w:r>
+            <w:proofErr w:type="spellEnd"/>
+            <w:r>
+              <w:rPr>
+                <w:rFonts w:ascii="Times New Roman" w:eastAsia="Times New Roman" w:hAnsi="Times New Roman" w:cs="Times New Roman"/>
+                <w:sz w:val="24"/>
+              </w:rPr>
+              <w:t xml:space="preserve">, llama.cpp, </w:t>
+            </w:r>
+            <w:proofErr w:type="spellStart"/>
+            <w:r>
+              <w:rPr>
+                <w:rFonts w:ascii="Times New Roman" w:eastAsia="Times New Roman" w:hAnsi="Times New Roman" w:cs="Times New Roman"/>
+                <w:sz w:val="24"/>
+              </w:rPr>
+              <w:t>Ollama</w:t>
+            </w:r>
+            <w:proofErr w:type="spellEnd"/>
           </w:p>
         </w:tc>
         <w:tc>
@@ -3616,12 +3766,21 @@
                 <w:sz w:val="24"/>
               </w:rPr>
             </w:pPr>
-            <w:r>
-              <w:rPr>
-                <w:rFonts w:ascii="Times New Roman" w:eastAsia="Times New Roman" w:hAnsi="Times New Roman" w:cs="Times New Roman"/>
-                <w:sz w:val="24"/>
-              </w:rPr>
-              <w:t>LiteLLM, Portkey, Kong AI Gateway, Cloudflare AI Gateway</w:t>
+            <w:proofErr w:type="spellStart"/>
+            <w:r>
+              <w:rPr>
+                <w:rFonts w:ascii="Times New Roman" w:eastAsia="Times New Roman" w:hAnsi="Times New Roman" w:cs="Times New Roman"/>
+                <w:sz w:val="24"/>
+              </w:rPr>
+              <w:t>LiteLLM</w:t>
+            </w:r>
+            <w:proofErr w:type="spellEnd"/>
+            <w:r>
+              <w:rPr>
+                <w:rFonts w:ascii="Times New Roman" w:eastAsia="Times New Roman" w:hAnsi="Times New Roman" w:cs="Times New Roman"/>
+                <w:sz w:val="24"/>
+              </w:rPr>
+              <w:t>, Portkey, Kong AI Gateway, Cloudflare AI Gateway</w:t>
             </w:r>
           </w:p>
         </w:tc>
@@ -3713,13 +3872,47 @@
                 <w:sz w:val="24"/>
               </w:rPr>
             </w:pPr>
-            <w:r>
-              <w:rPr>
-                <w:rFonts w:ascii="Times New Roman" w:eastAsia="Times New Roman" w:hAnsi="Times New Roman" w:cs="Times New Roman"/>
-                <w:sz w:val="24"/>
-              </w:rPr>
-              <w:t>LangGraph, Semantic Kernel, OpenAI Agents SDK, Google ADK, CrewAI</w:t>
-            </w:r>
+            <w:proofErr w:type="spellStart"/>
+            <w:r>
+              <w:rPr>
+                <w:rFonts w:ascii="Times New Roman" w:eastAsia="Times New Roman" w:hAnsi="Times New Roman" w:cs="Times New Roman"/>
+                <w:sz w:val="24"/>
+              </w:rPr>
+              <w:t>LangGraph</w:t>
+            </w:r>
+            <w:proofErr w:type="spellEnd"/>
+            <w:r>
+              <w:rPr>
+                <w:rFonts w:ascii="Times New Roman" w:eastAsia="Times New Roman" w:hAnsi="Times New Roman" w:cs="Times New Roman"/>
+                <w:sz w:val="24"/>
+              </w:rPr>
+              <w:t xml:space="preserve">, Semantic Kernel, </w:t>
+            </w:r>
+            <w:proofErr w:type="spellStart"/>
+            <w:r>
+              <w:rPr>
+                <w:rFonts w:ascii="Times New Roman" w:eastAsia="Times New Roman" w:hAnsi="Times New Roman" w:cs="Times New Roman"/>
+                <w:sz w:val="24"/>
+              </w:rPr>
+              <w:t>OpenAI</w:t>
+            </w:r>
+            <w:proofErr w:type="spellEnd"/>
+            <w:r>
+              <w:rPr>
+                <w:rFonts w:ascii="Times New Roman" w:eastAsia="Times New Roman" w:hAnsi="Times New Roman" w:cs="Times New Roman"/>
+                <w:sz w:val="24"/>
+              </w:rPr>
+              <w:t xml:space="preserve"> Agents SDK, Google ADK, </w:t>
+            </w:r>
+            <w:proofErr w:type="spellStart"/>
+            <w:r>
+              <w:rPr>
+                <w:rFonts w:ascii="Times New Roman" w:eastAsia="Times New Roman" w:hAnsi="Times New Roman" w:cs="Times New Roman"/>
+                <w:sz w:val="24"/>
+              </w:rPr>
+              <w:t>CrewAI</w:t>
+            </w:r>
+            <w:proofErr w:type="spellEnd"/>
           </w:p>
         </w:tc>
         <w:tc>
@@ -3769,6 +3962,7 @@
                 <w:rFonts w:ascii="Times New Roman" w:eastAsia="Times New Roman" w:hAnsi="Times New Roman" w:cs="Times New Roman"/>
                 <w:sz w:val="24"/>
               </w:rPr>
+              <w:lastRenderedPageBreak/>
               <w:t>Storage and knowledge systems</w:t>
             </w:r>
           </w:p>
@@ -3866,7 +4060,6 @@
                 <w:rFonts w:ascii="Times New Roman" w:eastAsia="Times New Roman" w:hAnsi="Times New Roman" w:cs="Times New Roman"/>
                 <w:sz w:val="24"/>
               </w:rPr>
-              <w:lastRenderedPageBreak/>
               <w:t>Evaluation and governance</w:t>
             </w:r>
           </w:p>
@@ -3908,12 +4101,69 @@
                 <w:sz w:val="24"/>
               </w:rPr>
             </w:pPr>
-            <w:r>
-              <w:rPr>
-                <w:rFonts w:ascii="Times New Roman" w:eastAsia="Times New Roman" w:hAnsi="Times New Roman" w:cs="Times New Roman"/>
-                <w:sz w:val="24"/>
-              </w:rPr>
-              <w:t>OpenEvals, DeepEval, LangSmith Evaluation, OpenAI Evals</w:t>
+            <w:proofErr w:type="spellStart"/>
+            <w:r>
+              <w:rPr>
+                <w:rFonts w:ascii="Times New Roman" w:eastAsia="Times New Roman" w:hAnsi="Times New Roman" w:cs="Times New Roman"/>
+                <w:sz w:val="24"/>
+              </w:rPr>
+              <w:t>OpenEvals</w:t>
+            </w:r>
+            <w:proofErr w:type="spellEnd"/>
+            <w:r>
+              <w:rPr>
+                <w:rFonts w:ascii="Times New Roman" w:eastAsia="Times New Roman" w:hAnsi="Times New Roman" w:cs="Times New Roman"/>
+                <w:sz w:val="24"/>
+              </w:rPr>
+              <w:t xml:space="preserve">, </w:t>
+            </w:r>
+            <w:proofErr w:type="spellStart"/>
+            <w:r>
+              <w:rPr>
+                <w:rFonts w:ascii="Times New Roman" w:eastAsia="Times New Roman" w:hAnsi="Times New Roman" w:cs="Times New Roman"/>
+                <w:sz w:val="24"/>
+              </w:rPr>
+              <w:t>DeepEval</w:t>
+            </w:r>
+            <w:proofErr w:type="spellEnd"/>
+            <w:r>
+              <w:rPr>
+                <w:rFonts w:ascii="Times New Roman" w:eastAsia="Times New Roman" w:hAnsi="Times New Roman" w:cs="Times New Roman"/>
+                <w:sz w:val="24"/>
+              </w:rPr>
+              <w:t xml:space="preserve">, </w:t>
+            </w:r>
+            <w:proofErr w:type="spellStart"/>
+            <w:r>
+              <w:rPr>
+                <w:rFonts w:ascii="Times New Roman" w:eastAsia="Times New Roman" w:hAnsi="Times New Roman" w:cs="Times New Roman"/>
+                <w:sz w:val="24"/>
+              </w:rPr>
+              <w:t>LangSmith</w:t>
+            </w:r>
+            <w:proofErr w:type="spellEnd"/>
+            <w:r>
+              <w:rPr>
+                <w:rFonts w:ascii="Times New Roman" w:eastAsia="Times New Roman" w:hAnsi="Times New Roman" w:cs="Times New Roman"/>
+                <w:sz w:val="24"/>
+              </w:rPr>
+              <w:t xml:space="preserve"> Evaluation, </w:t>
+            </w:r>
+            <w:proofErr w:type="spellStart"/>
+            <w:r>
+              <w:rPr>
+                <w:rFonts w:ascii="Times New Roman" w:eastAsia="Times New Roman" w:hAnsi="Times New Roman" w:cs="Times New Roman"/>
+                <w:sz w:val="24"/>
+              </w:rPr>
+              <w:t>OpenAI</w:t>
+            </w:r>
+            <w:proofErr w:type="spellEnd"/>
+            <w:r>
+              <w:rPr>
+                <w:rFonts w:ascii="Times New Roman" w:eastAsia="Times New Roman" w:hAnsi="Times New Roman" w:cs="Times New Roman"/>
+                <w:sz w:val="24"/>
+              </w:rPr>
+              <w:t xml:space="preserve"> Evals</w:t>
             </w:r>
           </w:p>
         </w:tc>
@@ -4010,7 +4260,23 @@
                 <w:rFonts w:ascii="Times New Roman" w:eastAsia="Times New Roman" w:hAnsi="Times New Roman" w:cs="Times New Roman"/>
                 <w:sz w:val="24"/>
               </w:rPr>
-              <w:t>Kubernetes, OpenTelemetry, Argo CD, Helm, Prometheus</w:t>
+              <w:t xml:space="preserve">Kubernetes, </w:t>
+            </w:r>
+            <w:proofErr w:type="spellStart"/>
+            <w:r>
+              <w:rPr>
+                <w:rFonts w:ascii="Times New Roman" w:eastAsia="Times New Roman" w:hAnsi="Times New Roman" w:cs="Times New Roman"/>
+                <w:sz w:val="24"/>
+              </w:rPr>
+              <w:t>OpenTelemetry</w:t>
+            </w:r>
+            <w:proofErr w:type="spellEnd"/>
+            <w:r>
+              <w:rPr>
+                <w:rFonts w:ascii="Times New Roman" w:eastAsia="Times New Roman" w:hAnsi="Times New Roman" w:cs="Times New Roman"/>
+                <w:sz w:val="24"/>
+              </w:rPr>
+              <w:t>, Argo CD, Helm, Prometheus</w:t>
             </w:r>
           </w:p>
         </w:tc>
@@ -4126,7 +4392,16 @@
           <w:sz w:val="28"/>
           <w:szCs w:val="24"/>
         </w:rPr>
-        <w:t>Throughout this book, technologies are therefore discussed primarily in terms of their architectural responsibilities and operational characteristics. Vendor comparisons are introduced only where they illuminate meaningful engineering trade-offs such as deployment flexibility, operational complexity, ecosystem maturity, licensing implications, or long-term maintainability.</w:t>
+        <w:t xml:space="preserve">Throughout this book, technologies are therefore discussed primarily in terms of their architectural responsibilities and operational characteristics. Vendor comparisons are introduced only where they illuminate meaningful engineering </w:t>
+      </w:r>
+      <w:r>
+        <w:rPr>
+          <w:rFonts w:ascii="Times New Roman" w:eastAsia="Times New Roman" w:hAnsi="Times New Roman" w:cs="Times New Roman"/>
+          <w:sz w:val="28"/>
+          <w:szCs w:val="24"/>
+        </w:rPr>
+        <w:lastRenderedPageBreak/>
+        <w:t>trade-offs such as deployment flexibility, operational complexity, ecosystem maturity, licensing implications, or long-term maintainability.</w:t>
       </w:r>
     </w:p>
     <w:p>
@@ -4171,8 +4446,106 @@
           <w:sz w:val="52"/>
           <w:szCs w:val="48"/>
         </w:rPr>
+        <w:t>1.5 AI Platform Architecture Is a System, Not a Model</w:t>
+      </w:r>
+    </w:p>
+    <w:p>
+      <w:pPr>
+        <w:spacing w:before="100" w:beforeAutospacing="1" w:after="100" w:afterAutospacing="1" w:line="240" w:lineRule="auto"/>
+        <w:rPr>
+          <w:rFonts w:ascii="Times New Roman" w:eastAsia="Times New Roman" w:hAnsi="Times New Roman" w:cs="Times New Roman"/>
+          <w:sz w:val="28"/>
+          <w:szCs w:val="24"/>
+        </w:rPr>
+      </w:pPr>
+      <w:r>
+        <w:rPr>
+          <w:rFonts w:ascii="Times New Roman" w:eastAsia="Times New Roman" w:hAnsi="Times New Roman" w:cs="Times New Roman"/>
+          <w:sz w:val="28"/>
+          <w:szCs w:val="24"/>
+        </w:rPr>
+        <w:t>Public discussions of artificial intelligence frequently focus almost exclusively on the capabilities of individual models. Benchmark rankings, reasoning performance, context length, and multimodal capabilities dominate technical announcements and media coverage. While these characteristics are important, they represent only one dimension of a production AI system.</w:t>
+      </w:r>
+    </w:p>
+    <w:p>
+      <w:pPr>
+        <w:spacing w:before="100" w:beforeAutospacing="1" w:after="100" w:afterAutospacing="1" w:line="240" w:lineRule="auto"/>
+        <w:rPr>
+          <w:rFonts w:ascii="Times New Roman" w:eastAsia="Times New Roman" w:hAnsi="Times New Roman" w:cs="Times New Roman"/>
+          <w:sz w:val="28"/>
+          <w:szCs w:val="24"/>
+        </w:rPr>
+      </w:pPr>
+      <w:r>
+        <w:rPr>
+          <w:rFonts w:ascii="Times New Roman" w:eastAsia="Times New Roman" w:hAnsi="Times New Roman" w:cs="Times New Roman"/>
+          <w:sz w:val="28"/>
+          <w:szCs w:val="24"/>
+        </w:rPr>
+        <w:t>From an engineering perspective, an AI platform is fundamentally a distributed software system whose purpose is to incorporate model inference into larger business processes.</w:t>
+      </w:r>
+    </w:p>
+    <w:p>
+      <w:pPr>
+        <w:spacing w:before="100" w:beforeAutospacing="1" w:after="100" w:afterAutospacing="1" w:line="240" w:lineRule="auto"/>
+        <w:rPr>
+          <w:rFonts w:ascii="Times New Roman" w:eastAsia="Times New Roman" w:hAnsi="Times New Roman" w:cs="Times New Roman"/>
+          <w:sz w:val="28"/>
+          <w:szCs w:val="24"/>
+        </w:rPr>
+      </w:pPr>
+      <w:r>
+        <w:rPr>
+          <w:rFonts w:ascii="Times New Roman" w:eastAsia="Times New Roman" w:hAnsi="Times New Roman" w:cs="Times New Roman"/>
+          <w:sz w:val="28"/>
+          <w:szCs w:val="24"/>
+        </w:rPr>
+        <w:t>A user interacting with an enterprise AI application rarely communicates directly with a model. Instead, requests typically traverse multiple infrastructure components before reaching an inference engine. Authentication services verify identity and authorization. AI gateways select an appropriate model provider and apply routing policies. Retrieval systems gather relevant organizational knowledge. Orchestration components coordinate tool execution or multi-step workflows. External services perform business operations, while telemetry systems record metrics, traces, and logs for operational analysis. The model participates in this workflow, but it is only one participant.</w:t>
+      </w:r>
+    </w:p>
+    <w:p>
+      <w:pPr>
+        <w:spacing w:before="100" w:beforeAutospacing="1" w:after="100" w:afterAutospacing="1" w:line="240" w:lineRule="auto"/>
+        <w:rPr>
+          <w:rFonts w:ascii="Times New Roman" w:eastAsia="Times New Roman" w:hAnsi="Times New Roman" w:cs="Times New Roman"/>
+          <w:sz w:val="28"/>
+          <w:szCs w:val="24"/>
+        </w:rPr>
+      </w:pPr>
+      <w:r>
+        <w:rPr>
+          <w:rFonts w:ascii="Times New Roman" w:eastAsia="Times New Roman" w:hAnsi="Times New Roman" w:cs="Times New Roman"/>
+          <w:sz w:val="28"/>
+          <w:szCs w:val="24"/>
+        </w:rPr>
+        <w:t>This distinction is significant because many production failures originate outside the model itself. A highly capable model cannot compensate for missing retrieval data, incorrect authorization policies, unavailable external services, network failures, deployment errors, or insufficient operational visibility. Conversely, robust platform engineering can often improve the reliability and usefulness of AI applications without changing the underlying model.</w:t>
+      </w:r>
+    </w:p>
+    <w:p>
+      <w:pPr>
+        <w:spacing w:before="100" w:beforeAutospacing="1" w:after="100" w:afterAutospacing="1" w:line="240" w:lineRule="auto"/>
+        <w:rPr>
+          <w:rFonts w:ascii="Times New Roman" w:eastAsia="Times New Roman" w:hAnsi="Times New Roman" w:cs="Times New Roman"/>
+          <w:sz w:val="28"/>
+          <w:szCs w:val="24"/>
+        </w:rPr>
+      </w:pPr>
+      <w:r>
+        <w:rPr>
+          <w:rFonts w:ascii="Times New Roman" w:eastAsia="Times New Roman" w:hAnsi="Times New Roman" w:cs="Times New Roman"/>
+          <w:sz w:val="28"/>
+          <w:szCs w:val="24"/>
+        </w:rPr>
+        <w:t xml:space="preserve">The architectural concerns governing AI platforms are therefore familiar to experienced software engineers. Scalability, fault tolerance, concurrency control, network communication, caching strategies, service discovery, authentication, authorization, observability, deployment automation, and disaster recovery remain </w:t>
+      </w:r>
+      <w:r>
+        <w:rPr>
+          <w:rFonts w:ascii="Times New Roman" w:eastAsia="Times New Roman" w:hAnsi="Times New Roman" w:cs="Times New Roman"/>
+          <w:sz w:val="28"/>
+          <w:szCs w:val="24"/>
+        </w:rPr>
         <w:lastRenderedPageBreak/>
-        <w:t>1.5 AI Platform Architecture Is a System, Not a Model</w:t>
+        <w:t>essential design considerations. AI introduces new workload characteristics, but it does not replace the established principles of distributed systems engineering.</w:t>
       </w:r>
     </w:p>
     <w:p>
@@ -4190,7 +4563,7 @@
           <w:sz w:val="28"/>
           <w:szCs w:val="24"/>
         </w:rPr>
-        <w:t>Public discussions of artificial intelligence frequently focus almost exclusively on the capabilities of individual models. Benchmark rankings, reasoning performance, context length, and multimodal capabilities dominate technical announcements and media coverage. While these characteristics are important, they represent only one dimension of a production AI system.</w:t>
+        <w:t>This observation explains why many successful AI platform teams are multidisciplinary. Platform engineers contribute expertise in infrastructure automation and cloud-native operations. Software engineers design application architectures and service interfaces. Site reliability engineers define operational objectives and incident response procedures. Security specialists establish governance policies and access controls. Data engineers manage information pipelines supporting retrieval and knowledge systems. AI specialists evaluate model capabilities and guide model selection. Effective platforms emerge through collaboration across these disciplines rather than through expertise in model development alone.</w:t>
       </w:r>
     </w:p>
     <w:p>
@@ -4208,111 +4581,12 @@
           <w:sz w:val="28"/>
           <w:szCs w:val="24"/>
         </w:rPr>
-        <w:t>From an engineering perspective, an AI platform is fundamentally a distributed software system whose purpose is to incorporate model inference into larger business processes.</w:t>
-      </w:r>
-    </w:p>
-    <w:p>
-      <w:pPr>
-        <w:spacing w:before="100" w:beforeAutospacing="1" w:after="100" w:afterAutospacing="1" w:line="240" w:lineRule="auto"/>
-        <w:rPr>
-          <w:rFonts w:ascii="Times New Roman" w:eastAsia="Times New Roman" w:hAnsi="Times New Roman" w:cs="Times New Roman"/>
-          <w:sz w:val="28"/>
-          <w:szCs w:val="24"/>
-        </w:rPr>
-      </w:pPr>
-      <w:r>
-        <w:rPr>
-          <w:rFonts w:ascii="Times New Roman" w:eastAsia="Times New Roman" w:hAnsi="Times New Roman" w:cs="Times New Roman"/>
-          <w:sz w:val="28"/>
-          <w:szCs w:val="24"/>
-        </w:rPr>
-        <w:t>A user interacting with an enterprise AI application rarely communicates directly with a model. Instead, requests typically traverse multiple infrastructure components before reaching an inference engine. Authentication services verify identity and authorization. AI gateways select an appropriate model provider and apply routing policies. Retrieval systems gather relevant organizational knowledge. Orchestration components coordinate tool execution or multi-step workflows. External services perform business operations, while telemetry systems record metrics, traces, and logs for operational analysis. The model participates in this workflow, but it is only one participant.</w:t>
-      </w:r>
-    </w:p>
-    <w:p>
-      <w:pPr>
-        <w:spacing w:before="100" w:beforeAutospacing="1" w:after="100" w:afterAutospacing="1" w:line="240" w:lineRule="auto"/>
-        <w:rPr>
-          <w:rFonts w:ascii="Times New Roman" w:eastAsia="Times New Roman" w:hAnsi="Times New Roman" w:cs="Times New Roman"/>
-          <w:sz w:val="28"/>
-          <w:szCs w:val="24"/>
-        </w:rPr>
-      </w:pPr>
-      <w:r>
-        <w:rPr>
-          <w:rFonts w:ascii="Times New Roman" w:eastAsia="Times New Roman" w:hAnsi="Times New Roman" w:cs="Times New Roman"/>
-          <w:sz w:val="28"/>
-          <w:szCs w:val="24"/>
-        </w:rPr>
-        <w:t>This distinction is significant because many production failures originate outside the model itself. A highly capable model cannot compensate for missing retrieval data, incorrect authorization policies, unavailable external services, network failures, deployment errors, or insufficient operational visibility. Conversely, robust platform engineering can often improve the reliability and usefulness of AI applications without changing the underlying model.</w:t>
-      </w:r>
-    </w:p>
-    <w:p>
-      <w:pPr>
-        <w:spacing w:before="100" w:beforeAutospacing="1" w:after="100" w:afterAutospacing="1" w:line="240" w:lineRule="auto"/>
-        <w:rPr>
-          <w:rFonts w:ascii="Times New Roman" w:eastAsia="Times New Roman" w:hAnsi="Times New Roman" w:cs="Times New Roman"/>
-          <w:sz w:val="28"/>
-          <w:szCs w:val="24"/>
-        </w:rPr>
-      </w:pPr>
-      <w:r>
-        <w:rPr>
-          <w:rFonts w:ascii="Times New Roman" w:eastAsia="Times New Roman" w:hAnsi="Times New Roman" w:cs="Times New Roman"/>
-          <w:sz w:val="28"/>
-          <w:szCs w:val="24"/>
-        </w:rPr>
-        <w:t>The architectural concerns governing AI platforms are therefore familiar to experienced software engineers. Scalability, fault tolerance, concurrency control, network communication, caching strategies, service discovery, authentication, authorization, observability, deployment automation, and disaster recovery remain essential design considerations. AI introduces new workload characteristics, but it does not replace the established principles of distributed systems engineering.</w:t>
-      </w:r>
-    </w:p>
-    <w:p>
-      <w:pPr>
-        <w:spacing w:before="100" w:beforeAutospacing="1" w:after="100" w:afterAutospacing="1" w:line="240" w:lineRule="auto"/>
-        <w:rPr>
-          <w:rFonts w:ascii="Times New Roman" w:eastAsia="Times New Roman" w:hAnsi="Times New Roman" w:cs="Times New Roman"/>
-          <w:sz w:val="28"/>
-          <w:szCs w:val="24"/>
-        </w:rPr>
-      </w:pPr>
-      <w:r>
-        <w:rPr>
-          <w:rFonts w:ascii="Times New Roman" w:eastAsia="Times New Roman" w:hAnsi="Times New Roman" w:cs="Times New Roman"/>
-          <w:sz w:val="28"/>
-          <w:szCs w:val="24"/>
-        </w:rPr>
-        <w:t xml:space="preserve">This observation explains why many successful AI platform teams are multidisciplinary. Platform engineers contribute expertise in infrastructure </w:t>
-      </w:r>
-      <w:r>
-        <w:rPr>
-          <w:rFonts w:ascii="Times New Roman" w:eastAsia="Times New Roman" w:hAnsi="Times New Roman" w:cs="Times New Roman"/>
-          <w:sz w:val="28"/>
-          <w:szCs w:val="24"/>
-        </w:rPr>
-        <w:lastRenderedPageBreak/>
-        <w:t>automation and cloud-native operations. Software engineers design application architectures and service interfaces. Site reliability engineers define operational objectives and incident response procedures. Security specialists establish governance policies and access controls. Data engineers manage information pipelines supporting retrieval and knowledge systems. AI specialists evaluate model capabilities and guide model selection. Effective platforms emerge through collaboration across these disciplines rather than through expertise in model development alone.</w:t>
-      </w:r>
-    </w:p>
-    <w:p>
-      <w:pPr>
-        <w:spacing w:before="100" w:beforeAutospacing="1" w:after="100" w:afterAutospacing="1" w:line="240" w:lineRule="auto"/>
-        <w:rPr>
-          <w:rFonts w:ascii="Times New Roman" w:eastAsia="Times New Roman" w:hAnsi="Times New Roman" w:cs="Times New Roman"/>
-          <w:sz w:val="28"/>
-          <w:szCs w:val="24"/>
-        </w:rPr>
-      </w:pPr>
-      <w:r>
-        <w:rPr>
-          <w:rFonts w:ascii="Times New Roman" w:eastAsia="Times New Roman" w:hAnsi="Times New Roman" w:cs="Times New Roman"/>
-          <w:sz w:val="28"/>
-          <w:szCs w:val="24"/>
-        </w:rPr>
         <w:t>Viewing AI systems as distributed platforms also changes how architectural success should be evaluated. Rather than asking whether a particular model achieves the highest benchmark score, engineers should consider broader operational questions.</w:t>
       </w:r>
     </w:p>
     <w:p>
       <w:pPr>
-        <w:pStyle w:val="a8"/>
+        <w:pStyle w:val="ListParagraph"/>
         <w:numPr>
           <w:ilvl w:val="0"/>
           <w:numId w:val="15"/>
@@ -4335,7 +4609,7 @@
     </w:p>
     <w:p>
       <w:pPr>
-        <w:pStyle w:val="a8"/>
+        <w:pStyle w:val="ListParagraph"/>
         <w:numPr>
           <w:ilvl w:val="0"/>
           <w:numId w:val="15"/>
@@ -4358,7 +4632,7 @@
     </w:p>
     <w:p>
       <w:pPr>
-        <w:pStyle w:val="a8"/>
+        <w:pStyle w:val="ListParagraph"/>
         <w:numPr>
           <w:ilvl w:val="0"/>
           <w:numId w:val="15"/>
@@ -4381,7 +4655,7 @@
     </w:p>
     <w:p>
       <w:pPr>
-        <w:pStyle w:val="a8"/>
+        <w:pStyle w:val="ListParagraph"/>
         <w:numPr>
           <w:ilvl w:val="0"/>
           <w:numId w:val="15"/>
@@ -4404,7 +4678,7 @@
     </w:p>
     <w:p>
       <w:pPr>
-        <w:pStyle w:val="a8"/>
+        <w:pStyle w:val="ListParagraph"/>
         <w:numPr>
           <w:ilvl w:val="0"/>
           <w:numId w:val="15"/>
@@ -4427,7 +4701,7 @@
     </w:p>
     <w:p>
       <w:pPr>
-        <w:pStyle w:val="a8"/>
+        <w:pStyle w:val="ListParagraph"/>
         <w:numPr>
           <w:ilvl w:val="0"/>
           <w:numId w:val="15"/>
@@ -4526,6 +4800,7 @@
           <w:sz w:val="52"/>
           <w:szCs w:val="48"/>
         </w:rPr>
+        <w:lastRenderedPageBreak/>
         <w:t>1.6 Engineering Decisions Versus Product Selection</w:t>
       </w:r>
     </w:p>
@@ -4562,133 +4837,133 @@
           <w:sz w:val="28"/>
           <w:szCs w:val="24"/>
         </w:rPr>
+        <w:t>Organizations often begin with questions such as "Which model should we use?" or "Which agent framework is best?" While understandable, these questions assume that product selection is the primary architectural decision. In practice, experienced platform engineers approach the problem from the opposite direction.</w:t>
+      </w:r>
+    </w:p>
+    <w:p>
+      <w:pPr>
+        <w:spacing w:before="100" w:beforeAutospacing="1" w:after="100" w:afterAutospacing="1" w:line="240" w:lineRule="auto"/>
+        <w:rPr>
+          <w:rFonts w:ascii="Times New Roman" w:eastAsia="Times New Roman" w:hAnsi="Times New Roman" w:cs="Times New Roman"/>
+          <w:sz w:val="28"/>
+          <w:szCs w:val="24"/>
+        </w:rPr>
+      </w:pPr>
+      <w:r>
+        <w:rPr>
+          <w:rFonts w:ascii="Times New Roman" w:eastAsia="Times New Roman" w:hAnsi="Times New Roman" w:cs="Times New Roman"/>
+          <w:sz w:val="28"/>
+          <w:szCs w:val="24"/>
+        </w:rPr>
+        <w:t>Engineering decisions begin with requirements.</w:t>
+      </w:r>
+    </w:p>
+    <w:p>
+      <w:pPr>
+        <w:spacing w:before="100" w:beforeAutospacing="1" w:after="100" w:afterAutospacing="1" w:line="240" w:lineRule="auto"/>
+        <w:rPr>
+          <w:rFonts w:ascii="Times New Roman" w:eastAsia="Times New Roman" w:hAnsi="Times New Roman" w:cs="Times New Roman"/>
+          <w:sz w:val="28"/>
+          <w:szCs w:val="24"/>
+        </w:rPr>
+      </w:pPr>
+      <w:r>
+        <w:rPr>
+          <w:rFonts w:ascii="Times New Roman" w:eastAsia="Times New Roman" w:hAnsi="Times New Roman" w:cs="Times New Roman"/>
+          <w:sz w:val="28"/>
+          <w:szCs w:val="24"/>
+        </w:rPr>
+        <w:t>Every production AI system operates under a unique combination of technical, organizational, regulatory, and financial constraints. These constraints determine which architectural approaches are feasible and, consequently, which technologies are appropriate. Selecting a model or framework before understanding these requirements frequently results in unnecessary complexity, vendor lock-in, or costly redesigns later in the project lifecycle.</w:t>
+      </w:r>
+    </w:p>
+    <w:p>
+      <w:pPr>
+        <w:spacing w:before="100" w:beforeAutospacing="1" w:after="100" w:afterAutospacing="1" w:line="240" w:lineRule="auto"/>
+        <w:rPr>
+          <w:rFonts w:ascii="Times New Roman" w:eastAsia="Times New Roman" w:hAnsi="Times New Roman" w:cs="Times New Roman"/>
+          <w:sz w:val="28"/>
+          <w:szCs w:val="24"/>
+        </w:rPr>
+      </w:pPr>
+      <w:r>
+        <w:rPr>
+          <w:rFonts w:ascii="Times New Roman" w:eastAsia="Times New Roman" w:hAnsi="Times New Roman" w:cs="Times New Roman"/>
+          <w:sz w:val="28"/>
+          <w:szCs w:val="24"/>
+        </w:rPr>
+        <w:t>Requirements can be divided into several broad categories.</w:t>
+      </w:r>
+    </w:p>
+    <w:p>
+      <w:pPr>
+        <w:spacing w:before="100" w:beforeAutospacing="1" w:after="100" w:afterAutospacing="1" w:line="240" w:lineRule="auto"/>
+        <w:rPr>
+          <w:rFonts w:ascii="Times New Roman" w:eastAsia="Times New Roman" w:hAnsi="Times New Roman" w:cs="Times New Roman"/>
+          <w:sz w:val="28"/>
+          <w:szCs w:val="24"/>
+        </w:rPr>
+      </w:pPr>
+      <w:r>
+        <w:rPr>
+          <w:rFonts w:ascii="Times New Roman" w:eastAsia="Times New Roman" w:hAnsi="Times New Roman" w:cs="Times New Roman"/>
+          <w:sz w:val="28"/>
+          <w:szCs w:val="24"/>
+        </w:rPr>
+        <w:t>Functional requirements describe the capabilities expected by users. Examples include conversational assistants, document analysis, software engineering support, multimodal processing, structured information extraction, or autonomous workflow execution.</w:t>
+      </w:r>
+    </w:p>
+    <w:p>
+      <w:pPr>
+        <w:spacing w:before="100" w:beforeAutospacing="1" w:after="100" w:afterAutospacing="1" w:line="240" w:lineRule="auto"/>
+        <w:rPr>
+          <w:rFonts w:ascii="Times New Roman" w:eastAsia="Times New Roman" w:hAnsi="Times New Roman" w:cs="Times New Roman"/>
+          <w:sz w:val="28"/>
+          <w:szCs w:val="24"/>
+        </w:rPr>
+      </w:pPr>
+      <w:r>
+        <w:rPr>
+          <w:rFonts w:ascii="Times New Roman" w:eastAsia="Times New Roman" w:hAnsi="Times New Roman" w:cs="Times New Roman"/>
+          <w:sz w:val="28"/>
+          <w:szCs w:val="24"/>
+        </w:rPr>
+        <w:t>Non-functional requirements often exert even greater influence over architectural decisions. Latency objectives, availability targets, geographic deployment constraints, regulatory obligations, privacy requirements, throughput expectations, operational maturity, and budget limitations frequently determine whether commercial APIs, self-hosted inference, or hybrid architectures are appropriate.</w:t>
+      </w:r>
+    </w:p>
+    <w:p>
+      <w:pPr>
+        <w:spacing w:before="100" w:beforeAutospacing="1" w:after="100" w:afterAutospacing="1" w:line="240" w:lineRule="auto"/>
+        <w:rPr>
+          <w:rFonts w:ascii="Times New Roman" w:eastAsia="Times New Roman" w:hAnsi="Times New Roman" w:cs="Times New Roman"/>
+          <w:sz w:val="28"/>
+          <w:szCs w:val="24"/>
+        </w:rPr>
+      </w:pPr>
+      <w:r>
+        <w:rPr>
+          <w:rFonts w:ascii="Times New Roman" w:eastAsia="Times New Roman" w:hAnsi="Times New Roman" w:cs="Times New Roman"/>
+          <w:sz w:val="28"/>
+          <w:szCs w:val="24"/>
+        </w:rPr>
+        <w:t>Organizational considerations are equally important. A small engineering team with limited operational experience may reasonably prioritize managed AI services to reduce infrastructure complexity. A large enterprise operating across multiple jurisdictions may instead prioritize deployment flexibility, governance, and infrastructure ownership despite higher operational costs. Neither decision is inherently superior; each reflects different organizational priorities.</w:t>
+      </w:r>
+    </w:p>
+    <w:p>
+      <w:pPr>
+        <w:spacing w:before="100" w:beforeAutospacing="1" w:after="100" w:afterAutospacing="1" w:line="240" w:lineRule="auto"/>
+        <w:rPr>
+          <w:rFonts w:ascii="Times New Roman" w:eastAsia="Times New Roman" w:hAnsi="Times New Roman" w:cs="Times New Roman"/>
+          <w:sz w:val="28"/>
+          <w:szCs w:val="24"/>
+        </w:rPr>
+      </w:pPr>
+      <w:r>
+        <w:rPr>
+          <w:rFonts w:ascii="Times New Roman" w:eastAsia="Times New Roman" w:hAnsi="Times New Roman" w:cs="Times New Roman"/>
+          <w:sz w:val="28"/>
+          <w:szCs w:val="24"/>
+        </w:rPr>
         <w:lastRenderedPageBreak/>
-        <w:t>Organizations often begin with questions such as "Which model should we use?" or "Which agent framework is best?" While understandable, these questions assume that product selection is the primary architectural decision. In practice, experienced platform engineers approach the problem from the opposite direction.</w:t>
-      </w:r>
-    </w:p>
-    <w:p>
-      <w:pPr>
-        <w:spacing w:before="100" w:beforeAutospacing="1" w:after="100" w:afterAutospacing="1" w:line="240" w:lineRule="auto"/>
-        <w:rPr>
-          <w:rFonts w:ascii="Times New Roman" w:eastAsia="Times New Roman" w:hAnsi="Times New Roman" w:cs="Times New Roman"/>
-          <w:sz w:val="28"/>
-          <w:szCs w:val="24"/>
-        </w:rPr>
-      </w:pPr>
-      <w:r>
-        <w:rPr>
-          <w:rFonts w:ascii="Times New Roman" w:eastAsia="Times New Roman" w:hAnsi="Times New Roman" w:cs="Times New Roman"/>
-          <w:sz w:val="28"/>
-          <w:szCs w:val="24"/>
-        </w:rPr>
-        <w:t>Engineering decisions begin with requirements.</w:t>
-      </w:r>
-    </w:p>
-    <w:p>
-      <w:pPr>
-        <w:spacing w:before="100" w:beforeAutospacing="1" w:after="100" w:afterAutospacing="1" w:line="240" w:lineRule="auto"/>
-        <w:rPr>
-          <w:rFonts w:ascii="Times New Roman" w:eastAsia="Times New Roman" w:hAnsi="Times New Roman" w:cs="Times New Roman"/>
-          <w:sz w:val="28"/>
-          <w:szCs w:val="24"/>
-        </w:rPr>
-      </w:pPr>
-      <w:r>
-        <w:rPr>
-          <w:rFonts w:ascii="Times New Roman" w:eastAsia="Times New Roman" w:hAnsi="Times New Roman" w:cs="Times New Roman"/>
-          <w:sz w:val="28"/>
-          <w:szCs w:val="24"/>
-        </w:rPr>
-        <w:t>Every production AI system operates under a unique combination of technical, organizational, regulatory, and financial constraints. These constraints determine which architectural approaches are feasible and, consequently, which technologies are appropriate. Selecting a model or framework before understanding these requirements frequently results in unnecessary complexity, vendor lock-in, or costly redesigns later in the project lifecycle.</w:t>
-      </w:r>
-    </w:p>
-    <w:p>
-      <w:pPr>
-        <w:spacing w:before="100" w:beforeAutospacing="1" w:after="100" w:afterAutospacing="1" w:line="240" w:lineRule="auto"/>
-        <w:rPr>
-          <w:rFonts w:ascii="Times New Roman" w:eastAsia="Times New Roman" w:hAnsi="Times New Roman" w:cs="Times New Roman"/>
-          <w:sz w:val="28"/>
-          <w:szCs w:val="24"/>
-        </w:rPr>
-      </w:pPr>
-      <w:r>
-        <w:rPr>
-          <w:rFonts w:ascii="Times New Roman" w:eastAsia="Times New Roman" w:hAnsi="Times New Roman" w:cs="Times New Roman"/>
-          <w:sz w:val="28"/>
-          <w:szCs w:val="24"/>
-        </w:rPr>
-        <w:t>Requirements can be divided into several broad categories.</w:t>
-      </w:r>
-    </w:p>
-    <w:p>
-      <w:pPr>
-        <w:spacing w:before="100" w:beforeAutospacing="1" w:after="100" w:afterAutospacing="1" w:line="240" w:lineRule="auto"/>
-        <w:rPr>
-          <w:rFonts w:ascii="Times New Roman" w:eastAsia="Times New Roman" w:hAnsi="Times New Roman" w:cs="Times New Roman"/>
-          <w:sz w:val="28"/>
-          <w:szCs w:val="24"/>
-        </w:rPr>
-      </w:pPr>
-      <w:r>
-        <w:rPr>
-          <w:rFonts w:ascii="Times New Roman" w:eastAsia="Times New Roman" w:hAnsi="Times New Roman" w:cs="Times New Roman"/>
-          <w:sz w:val="28"/>
-          <w:szCs w:val="24"/>
-        </w:rPr>
-        <w:t>Functional requirements describe the capabilities expected by users. Examples include conversational assistants, document analysis, software engineering support, multimodal processing, structured information extraction, or autonomous workflow execution.</w:t>
-      </w:r>
-    </w:p>
-    <w:p>
-      <w:pPr>
-        <w:spacing w:before="100" w:beforeAutospacing="1" w:after="100" w:afterAutospacing="1" w:line="240" w:lineRule="auto"/>
-        <w:rPr>
-          <w:rFonts w:ascii="Times New Roman" w:eastAsia="Times New Roman" w:hAnsi="Times New Roman" w:cs="Times New Roman"/>
-          <w:sz w:val="28"/>
-          <w:szCs w:val="24"/>
-        </w:rPr>
-      </w:pPr>
-      <w:r>
-        <w:rPr>
-          <w:rFonts w:ascii="Times New Roman" w:eastAsia="Times New Roman" w:hAnsi="Times New Roman" w:cs="Times New Roman"/>
-          <w:sz w:val="28"/>
-          <w:szCs w:val="24"/>
-        </w:rPr>
-        <w:t>Non-functional requirements often exert even greater influence over architectural decisions. Latency objectives, availability targets, geographic deployment constraints, regulatory obligations, privacy requirements, throughput expectations, operational maturity, and budget limitations frequently determine whether commercial APIs, self-hosted inference, or hybrid architectures are appropriate.</w:t>
-      </w:r>
-    </w:p>
-    <w:p>
-      <w:pPr>
-        <w:spacing w:before="100" w:beforeAutospacing="1" w:after="100" w:afterAutospacing="1" w:line="240" w:lineRule="auto"/>
-        <w:rPr>
-          <w:rFonts w:ascii="Times New Roman" w:eastAsia="Times New Roman" w:hAnsi="Times New Roman" w:cs="Times New Roman"/>
-          <w:sz w:val="28"/>
-          <w:szCs w:val="24"/>
-        </w:rPr>
-      </w:pPr>
-      <w:r>
-        <w:rPr>
-          <w:rFonts w:ascii="Times New Roman" w:eastAsia="Times New Roman" w:hAnsi="Times New Roman" w:cs="Times New Roman"/>
-          <w:sz w:val="28"/>
-          <w:szCs w:val="24"/>
-        </w:rPr>
-        <w:t>Organizational considerations are equally important. A small engineering team with limited operational experience may reasonably prioritize managed AI services to reduce infrastructure complexity. A large enterprise operating across multiple jurisdictions may instead prioritize deployment flexibility, governance, and infrastructure ownership despite higher operational costs. Neither decision is inherently superior; each reflects different organizational priorities.</w:t>
-      </w:r>
-    </w:p>
-    <w:p>
-      <w:pPr>
-        <w:spacing w:before="100" w:beforeAutospacing="1" w:after="100" w:afterAutospacing="1" w:line="240" w:lineRule="auto"/>
-        <w:rPr>
-          <w:rFonts w:ascii="Times New Roman" w:eastAsia="Times New Roman" w:hAnsi="Times New Roman" w:cs="Times New Roman"/>
-          <w:sz w:val="28"/>
-          <w:szCs w:val="24"/>
-        </w:rPr>
-      </w:pPr>
-      <w:r>
-        <w:rPr>
-          <w:rFonts w:ascii="Times New Roman" w:eastAsia="Times New Roman" w:hAnsi="Times New Roman" w:cs="Times New Roman"/>
-          <w:sz w:val="28"/>
-          <w:szCs w:val="24"/>
-        </w:rPr>
         <w:t>These relationships illustrate an important principle of platform engineering: requirements drive architecture, and architecture constrains technology selection.</w:t>
       </w:r>
     </w:p>
@@ -4761,7 +5036,6 @@
                 <w:bCs/>
                 <w:sz w:val="24"/>
               </w:rPr>
-              <w:lastRenderedPageBreak/>
               <w:t>Requirement</w:t>
             </w:r>
           </w:p>
@@ -5319,7 +5593,16 @@
           <w:sz w:val="28"/>
           <w:szCs w:val="24"/>
         </w:rPr>
-        <w:t>Throughout the remainder of this book, technologies are therefore evaluated using a consistent set of engineering criteria rather than popularity or novelty. These criteria include architectural compatibility, operational maturity, deployment flexibility, ecosystem support, interoperability, security posture, performance characteristics, total cost of ownership, and long-term maintainability. This framework provides a more durable basis for technology selection than chasing the latest benchmark leader or framework release.</w:t>
+        <w:t xml:space="preserve">Throughout the remainder of this book, technologies are therefore evaluated using a consistent set of engineering criteria rather than popularity or novelty. These criteria include architectural compatibility, operational maturity, deployment </w:t>
+      </w:r>
+      <w:r>
+        <w:rPr>
+          <w:rFonts w:ascii="Times New Roman" w:eastAsia="Times New Roman" w:hAnsi="Times New Roman" w:cs="Times New Roman"/>
+          <w:sz w:val="28"/>
+          <w:szCs w:val="24"/>
+        </w:rPr>
+        <w:lastRenderedPageBreak/>
+        <w:t>flexibility, ecosystem support, interoperability, security posture, performance characteristics, total cost of ownership, and long-term maintainability. This framework provides a more durable basis for technology selection than chasing the latest benchmark leader or framework release.</w:t>
       </w:r>
     </w:p>
     <w:p>
@@ -5337,83 +5620,159 @@
           <w:sz w:val="28"/>
           <w:szCs w:val="24"/>
         </w:rPr>
+        <w:t>The following sections build upon this philosophy by examining how evidence should be gathered, interpreted, and applied when evaluating rapidly evolving AI technologies.</w:t>
+      </w:r>
+    </w:p>
+    <w:p>
+      <w:pPr>
+        <w:pStyle w:val="Heading1"/>
+        <w:rPr>
+          <w:sz w:val="52"/>
+        </w:rPr>
+      </w:pPr>
+      <w:r>
+        <w:rPr>
+          <w:sz w:val="52"/>
+        </w:rPr>
+        <w:t>1.7 Understanding the AI Hype Cycle</w:t>
+      </w:r>
+    </w:p>
+    <w:p>
+      <w:pPr>
+        <w:pStyle w:val="NormalWeb"/>
+        <w:rPr>
+          <w:sz w:val="28"/>
+        </w:rPr>
+      </w:pPr>
+      <w:r>
+        <w:rPr>
+          <w:sz w:val="28"/>
+        </w:rPr>
+        <w:t>Few areas of software engineering evolve as rapidly—or generate as much public attention—as generative artificial intelligence. New foundation models, benchmarks, inference techniques, and agent frameworks are announced at a pace that can make the ecosystem appear fundamentally different every few months. Marketing materials often describe each release as a major breakthrough, while social media amplifies benchmark improvements, demonstration videos, and anecdotal success stories. For engineers responsible for long-lived production systems, this environment creates a difficult challenge: distinguishing durable technological progress from short-term market excitement.</w:t>
+      </w:r>
+    </w:p>
+    <w:p>
+      <w:pPr>
+        <w:pStyle w:val="NormalWeb"/>
+        <w:rPr>
+          <w:sz w:val="28"/>
+        </w:rPr>
+      </w:pPr>
+      <w:r>
+        <w:rPr>
+          <w:sz w:val="28"/>
+        </w:rPr>
+        <w:t xml:space="preserve">Every emerging technology </w:t>
+      </w:r>
+      <w:proofErr w:type="gramStart"/>
+      <w:r>
+        <w:rPr>
+          <w:sz w:val="28"/>
+        </w:rPr>
+        <w:t>experiences</w:t>
+      </w:r>
+      <w:proofErr w:type="gramEnd"/>
+      <w:r>
+        <w:rPr>
+          <w:sz w:val="28"/>
+        </w:rPr>
+        <w:t xml:space="preserve"> periods during which expectations temporarily exceed practical capabilities. Artificial intelligence is no exception. Many concepts that are now considered standard—including deep learning, cloud computing, containers, and Kubernetes—experienced cycles of intense enthusiasm followed by more measured adoption as engineering practice matured. Over time, successful technologies become integrated into broader software ecosystems, while others fail to achieve widespread operational use despite early attention.</w:t>
+      </w:r>
+    </w:p>
+    <w:p>
+      <w:pPr>
+        <w:pStyle w:val="NormalWeb"/>
+        <w:rPr>
+          <w:sz w:val="28"/>
+        </w:rPr>
+      </w:pPr>
+      <w:r>
+        <w:rPr>
+          <w:sz w:val="28"/>
+        </w:rPr>
+        <w:t>The current AI ecosystem exhibits many characteristics of this maturation process. Foundation models continue to improve rapidly, but advances in model capability are only one dimension of platform evolution. Equally important developments have occurred in inference optimization, AI networking, retrieval systems, governance, evaluation methodologies, and operational tooling. Many of these improvements receive less public attention than new model releases, yet they often have greater impact on the reliability and maintainability of production systems.</w:t>
+      </w:r>
+    </w:p>
+    <w:p>
+      <w:pPr>
+        <w:pStyle w:val="NormalWeb"/>
+        <w:rPr>
+          <w:sz w:val="28"/>
+        </w:rPr>
+      </w:pPr>
+      <w:r>
+        <w:rPr>
+          <w:sz w:val="28"/>
+        </w:rPr>
+        <w:t xml:space="preserve">For this reason, engineers should avoid equating technological visibility with architectural importance. The components that receive the least attention in product announcements—deployment automation, observability, authentication, policy </w:t>
+      </w:r>
+      <w:r>
+        <w:rPr>
+          <w:sz w:val="28"/>
+        </w:rPr>
         <w:lastRenderedPageBreak/>
-        <w:t>The following sections build upon this philosophy by examining how evidence should be gathered, interpreted, and applied when evaluating rapidly evolving AI technologies.</w:t>
-      </w:r>
-    </w:p>
-    <w:p>
-      <w:pPr>
-        <w:pStyle w:val="1"/>
-        <w:rPr>
-          <w:sz w:val="52"/>
-        </w:rPr>
-      </w:pPr>
-      <w:r>
-        <w:rPr>
-          <w:sz w:val="52"/>
-        </w:rPr>
-        <w:t>1.7 Understanding the AI Hype Cycle</w:t>
-      </w:r>
-    </w:p>
-    <w:p>
-      <w:pPr>
-        <w:pStyle w:val="a3"/>
-        <w:rPr>
-          <w:sz w:val="28"/>
-        </w:rPr>
-      </w:pPr>
-      <w:r>
-        <w:rPr>
-          <w:sz w:val="28"/>
-        </w:rPr>
-        <w:t>Few areas of software engineering evolve as rapidly—or generate as much public attention—as generative artificial intelligence. New foundation models, benchmarks, inference techniques, and agent frameworks are announced at a pace that can make the ecosystem appear fundamentally different every few months. Marketing materials often describe each release as a major breakthrough, while social media amplifies benchmark improvements, demonstration videos, and anecdotal success stories. For engineers responsible for long-lived production systems, this environment creates a difficult challenge: distinguishing durable technological progress from short-term market excitement.</w:t>
-      </w:r>
-    </w:p>
-    <w:p>
-      <w:pPr>
-        <w:pStyle w:val="a3"/>
-        <w:rPr>
-          <w:sz w:val="28"/>
-        </w:rPr>
-      </w:pPr>
-      <w:r>
-        <w:rPr>
-          <w:sz w:val="28"/>
-        </w:rPr>
-        <w:t>Every emerging technology experiences periods during which expectations temporarily exceed practical capabilities. Artificial intelligence is no exception. Many concepts that are now considered standard—including deep learning, cloud computing, containers, and Kubernetes—experienced cycles of intense enthusiasm followed by more measured adoption as engineering practice matured. Over time, successful technologies become integrated into broader software ecosystems, while others fail to achieve widespread operational use despite early attention.</w:t>
-      </w:r>
-    </w:p>
-    <w:p>
-      <w:pPr>
-        <w:pStyle w:val="a3"/>
-        <w:rPr>
-          <w:sz w:val="28"/>
-        </w:rPr>
-      </w:pPr>
-      <w:r>
-        <w:rPr>
-          <w:sz w:val="28"/>
-        </w:rPr>
-        <w:t>The current AI ecosystem exhibits many characteristics of this maturation process. Foundation models continue to improve rapidly, but advances in model capability are only one dimension of platform evolution. Equally important developments have occurred in inference optimization, AI networking, retrieval systems, governance, evaluation methodologies, and operational tooling. Many of these improvements receive less public attention than new model releases, yet they often have greater impact on the reliability and maintainability of production systems.</w:t>
-      </w:r>
-    </w:p>
-    <w:p>
-      <w:pPr>
-        <w:pStyle w:val="a3"/>
-        <w:rPr>
-          <w:sz w:val="28"/>
-        </w:rPr>
-      </w:pPr>
-      <w:r>
-        <w:rPr>
-          <w:sz w:val="28"/>
-        </w:rPr>
-        <w:t>For this reason, engineers should avoid equating technological visibility with architectural importance. The components that receive the least attention in product announcements—deployment automation, observability, authentication, policy enforcement, caching, version management, and operational governance—are frequently those that determine whether an AI capability can be operated successfully at enterprise scale.</w:t>
-      </w:r>
-    </w:p>
-    <w:p>
-      <w:pPr>
-        <w:pStyle w:val="a3"/>
+        <w:t>enforcement, caching, version management, and operational governance—are frequently those that determine whether an AI capability can be operated successfully at enterprise scale.</w:t>
+      </w:r>
+    </w:p>
+    <w:p>
+      <w:pPr>
+        <w:pStyle w:val="NormalWeb"/>
+        <w:rPr>
+          <w:sz w:val="28"/>
+        </w:rPr>
+      </w:pPr>
+      <w:r>
+        <w:rPr>
+          <w:sz w:val="28"/>
+        </w:rPr>
+        <w:t>The rapid pace of announcements also creates an illusion that complete architectural redesign is constantly required. In reality, most production platforms evolve incrementally. Organizations rarely replace every component simultaneously. Instead, new models are introduced behind stable interfaces, inference engines are upgraded independently of application logic, evaluation frameworks evolve without changing deployment pipelines, and governance policies mature alongside regulatory requirements. Well-designed platforms intentionally isolate these changes through abstraction layers and modular architecture.</w:t>
+      </w:r>
+    </w:p>
+    <w:p>
+      <w:pPr>
+        <w:pStyle w:val="NormalWeb"/>
+        <w:rPr>
+          <w:sz w:val="28"/>
+        </w:rPr>
+      </w:pPr>
+      <w:r>
+        <w:rPr>
+          <w:sz w:val="28"/>
+        </w:rPr>
+        <w:t>Another source of confusion arises from the different time horizons associated with AI technologies. Models may improve every few months, inference engines several times each year, and orchestration frameworks evolve rapidly as new programming paradigms emerge. By contrast, distributed systems principles, networking protocols, authentication standards, relational databases, container orchestration, and observability frameworks evolve much more gradually. Recognizing this distinction helps engineers invest their attention appropriately. Stable architectural principles deserve long-term commitment, whereas rapidly evolving technologies should be incorporated through interfaces that minimize future migration effort.</w:t>
+      </w:r>
+    </w:p>
+    <w:p>
+      <w:pPr>
+        <w:pStyle w:val="NormalWeb"/>
+        <w:rPr>
+          <w:sz w:val="28"/>
+        </w:rPr>
+      </w:pPr>
+      <w:r>
+        <w:rPr>
+          <w:sz w:val="28"/>
+        </w:rPr>
+        <w:t>The visibility of AI announcements can also distort engineering priorities. Public discussion frequently centers on identifying the "best" model or the newest agent framework, even though these decisions rarely determine overall platform success. A production system with slightly lower benchmark performance but strong governance, predictable deployment processes, comprehensive observability, and efficient operational practices will often deliver greater long-term business value than a system built around the latest model but lacking operational maturity.</w:t>
+      </w:r>
+    </w:p>
+    <w:p>
+      <w:pPr>
+        <w:pStyle w:val="NormalWeb"/>
+        <w:rPr>
+          <w:sz w:val="28"/>
+        </w:rPr>
+      </w:pPr>
+      <w:r>
+        <w:rPr>
+          <w:sz w:val="28"/>
+        </w:rPr>
+        <w:t>The objective of this chapter is therefore not to discourage adoption of new technologies, but to encourage disciplined evaluation. Innovation should be embraced when it addresses identifiable engineering problems and demonstrates measurable advantages under realistic production conditions. Novelty alone is not sufficient justification for architectural change.</w:t>
+      </w:r>
+    </w:p>
+    <w:p>
+      <w:pPr>
+        <w:pStyle w:val="NormalWeb"/>
         <w:rPr>
           <w:sz w:val="28"/>
         </w:rPr>
@@ -5423,70 +5782,7 @@
           <w:sz w:val="28"/>
         </w:rPr>
         <w:lastRenderedPageBreak/>
-        <w:t>The rapid pace of announcements also creates an illusion that complete architectural redesign is constantly required. In reality, most production platforms evolve incrementally. Organizations rarely replace every component simultaneously. Instead, new models are introduced behind stable interfaces, inference engines are upgraded independently of application logic, evaluation frameworks evolve without changing deployment pipelines, and governance policies mature alongside regulatory requirements. Well-designed platforms intentionally isolate these changes through abstraction layers and modular architecture.</w:t>
-      </w:r>
-    </w:p>
-    <w:p>
-      <w:pPr>
-        <w:pStyle w:val="a3"/>
-        <w:rPr>
-          <w:sz w:val="28"/>
-        </w:rPr>
-      </w:pPr>
-      <w:r>
-        <w:rPr>
-          <w:sz w:val="28"/>
-        </w:rPr>
-        <w:t>Another source of confusion arises from the different time horizons associated with AI technologies. Models may improve every few months, inference engines several times each year, and orchestration frameworks evolve rapidly as new programming paradigms emerge. By contrast, distributed systems principles, networking protocols, authentication standards, relational databases, container orchestration, and observability frameworks evolve much more gradually. Recognizing this distinction helps engineers invest their attention appropriately. Stable architectural principles deserve long-term commitment, whereas rapidly evolving technologies should be incorporated through interfaces that minimize future migration effort.</w:t>
-      </w:r>
-    </w:p>
-    <w:p>
-      <w:pPr>
-        <w:pStyle w:val="a3"/>
-        <w:rPr>
-          <w:sz w:val="28"/>
-        </w:rPr>
-      </w:pPr>
-      <w:r>
-        <w:rPr>
-          <w:sz w:val="28"/>
-        </w:rPr>
-        <w:t>The visibility of AI announcements can also distort engineering priorities. Public discussion frequently centers on identifying the "best" model or the newest agent framework, even though these decisions rarely determine overall platform success. A production system with slightly lower benchmark performance but strong governance, predictable deployment processes, comprehensive observability, and efficient operational practices will often deliver greater long-term business value than a system built around the latest model but lacking operational maturity.</w:t>
-      </w:r>
-    </w:p>
-    <w:p>
-      <w:pPr>
-        <w:pStyle w:val="a3"/>
-        <w:rPr>
-          <w:sz w:val="28"/>
-        </w:rPr>
-      </w:pPr>
-      <w:r>
-        <w:rPr>
-          <w:sz w:val="28"/>
-        </w:rPr>
-        <w:t>The objective of this chapter is therefore not to discourage adoption of new technologies, but to encourage disciplined evaluation. Innovation should be embraced when it addresses identifiable engineering problems and demonstrates measurable advantages under realistic production conditions. Novelty alone is not sufficient justification for architectural change.</w:t>
-      </w:r>
-    </w:p>
-    <w:p>
-      <w:pPr>
-        <w:pStyle w:val="a3"/>
-        <w:rPr>
-          <w:sz w:val="28"/>
-        </w:rPr>
-      </w:pPr>
-      <w:r>
-        <w:rPr>
-          <w:sz w:val="28"/>
-        </w:rPr>
-        <w:t xml:space="preserve">Throughout this book, technologies are presented according to their engineering maturity rather than their popularity. Mature technologies represent established industry practice supported by operational experience and stable ecosystems. Emerging technologies may offer significant potential but often require additional evaluation before they become suitable for critical production workloads. </w:t>
-      </w:r>
-      <w:r>
-        <w:rPr>
-          <w:sz w:val="28"/>
-        </w:rPr>
-        <w:lastRenderedPageBreak/>
-        <w:t>Understanding this distinction allows organizations to innovate without exposing core business systems to unnecessary operational risk.</w:t>
+        <w:t>Throughout this book, technologies are presented according to their engineering maturity rather than their popularity. Mature technologies represent established industry practice supported by operational experience and stable ecosystems. Emerging technologies may offer significant potential but often require additional evaluation before they become suitable for critical production workloads. Understanding this distinction allows organizations to innovate without exposing core business systems to unnecessary operational risk.</w:t>
       </w:r>
     </w:p>
     <w:p>
@@ -5506,7 +5802,7 @@
     </w:p>
     <w:p>
       <w:pPr>
-        <w:pStyle w:val="1"/>
+        <w:pStyle w:val="Heading1"/>
         <w:rPr>
           <w:sz w:val="52"/>
         </w:rPr>
@@ -5520,7 +5816,7 @@
     </w:p>
     <w:p>
       <w:pPr>
-        <w:pStyle w:val="a3"/>
+        <w:pStyle w:val="NormalWeb"/>
         <w:rPr>
           <w:sz w:val="28"/>
         </w:rPr>
@@ -5534,7 +5830,7 @@
     </w:p>
     <w:p>
       <w:pPr>
-        <w:pStyle w:val="a3"/>
+        <w:pStyle w:val="NormalWeb"/>
         <w:rPr>
           <w:sz w:val="28"/>
         </w:rPr>
@@ -5548,7 +5844,7 @@
     </w:p>
     <w:p>
       <w:pPr>
-        <w:pStyle w:val="a3"/>
+        <w:pStyle w:val="NormalWeb"/>
         <w:rPr>
           <w:sz w:val="28"/>
         </w:rPr>
@@ -5562,50 +5858,70 @@
     </w:p>
     <w:p>
       <w:pPr>
-        <w:pStyle w:val="a3"/>
-        <w:rPr>
-          <w:sz w:val="28"/>
-        </w:rPr>
-      </w:pPr>
-      <w:r>
-        <w:rPr>
-          <w:sz w:val="28"/>
-        </w:rPr>
-        <w:t>Research papers serve a different purpose. Peer-reviewed publications and technical reports explain algorithms, system designs, architectural innovations, and experimental methodology in considerably greater detail than product documentation. Foundational papers often remain valuable long after specific implementations have evolved because they explain the engineering rationale behind important techniques such as Transformer architectures, attention mechanisms, scaling laws, retrieval methods, or inference optimization.</w:t>
-      </w:r>
-    </w:p>
-    <w:p>
-      <w:pPr>
-        <w:pStyle w:val="a3"/>
-        <w:rPr>
-          <w:sz w:val="28"/>
-        </w:rPr>
-      </w:pPr>
+        <w:pStyle w:val="NormalWeb"/>
+        <w:rPr>
+          <w:sz w:val="28"/>
+        </w:rPr>
+      </w:pPr>
+      <w:r>
+        <w:rPr>
+          <w:sz w:val="28"/>
+        </w:rPr>
+        <w:t xml:space="preserve">Research papers serve a different purpose. Peer-reviewed publications and technical reports explain algorithms, system designs, architectural innovations, and experimental methodology in considerably greater detail than product documentation. Foundational papers often remain valuable long after specific </w:t>
+      </w:r>
       <w:r>
         <w:rPr>
           <w:sz w:val="28"/>
         </w:rPr>
         <w:lastRenderedPageBreak/>
+        <w:t>implementations have evolved because they explain the engineering rationale behind important techniques such as Transformer architectures, attention mechanisms, scaling laws, retrieval methods, or inference optimization.</w:t>
+      </w:r>
+    </w:p>
+    <w:p>
+      <w:pPr>
+        <w:pStyle w:val="NormalWeb"/>
+        <w:rPr>
+          <w:sz w:val="28"/>
+        </w:rPr>
+      </w:pPr>
+      <w:r>
+        <w:rPr>
+          <w:sz w:val="28"/>
+        </w:rPr>
         <w:t>Engineering blogs occupy an intermediate position between research and documentation. Technical organizations increasingly publish detailed articles describing production architectures, infrastructure optimizations, operational challenges, and engineering trade-offs encountered while operating large-scale AI systems. Although these articles generally describe real production experience, they should still be interpreted within the context of the author's infrastructure, workload characteristics, and organizational priorities. An optimization that produces substantial improvements for a hyperscale cloud provider may offer limited benefits for a small enterprise deployment.</w:t>
       </w:r>
     </w:p>
     <w:p>
       <w:pPr>
-        <w:pStyle w:val="a3"/>
-        <w:rPr>
-          <w:sz w:val="28"/>
-        </w:rPr>
-      </w:pPr>
-      <w:r>
-        <w:rPr>
-          <w:sz w:val="28"/>
-        </w:rPr>
-        <w:t>Independent benchmarks and community evaluations provide another valuable perspective because they attempt to compare technologies under common evaluation conditions. Organizations such as MLCommons have demonstrated the importance of standardized benchmarking methodology for inference performance, while independent evaluation frameworks increasingly assess language models using publicly documented procedures. These sources often provide more reproducible evidence than isolated vendor demonstrations because they define explicit testing methodologies and encourage comparable experimental conditions.</w:t>
-      </w:r>
-    </w:p>
-    <w:p>
-      <w:pPr>
-        <w:pStyle w:val="a3"/>
+        <w:pStyle w:val="NormalWeb"/>
+        <w:rPr>
+          <w:sz w:val="28"/>
+        </w:rPr>
+      </w:pPr>
+      <w:r>
+        <w:rPr>
+          <w:sz w:val="28"/>
+        </w:rPr>
+        <w:t xml:space="preserve">Independent benchmarks and community evaluations provide another valuable perspective because they attempt to compare technologies under common evaluation conditions. Organizations such as </w:t>
+      </w:r>
+      <w:proofErr w:type="spellStart"/>
+      <w:r>
+        <w:rPr>
+          <w:sz w:val="28"/>
+        </w:rPr>
+        <w:t>MLCommons</w:t>
+      </w:r>
+      <w:proofErr w:type="spellEnd"/>
+      <w:r>
+        <w:rPr>
+          <w:sz w:val="28"/>
+        </w:rPr>
+        <w:t xml:space="preserve"> have demonstrated the importance of standardized benchmarking methodology for inference performance, while independent evaluation frameworks increasingly assess language models using publicly documented procedures. These sources often provide more reproducible evidence than isolated vendor demonstrations because they define explicit testing methodologies and encourage comparable experimental conditions.</w:t>
+      </w:r>
+    </w:p>
+    <w:p>
+      <w:pPr>
+        <w:pStyle w:val="NormalWeb"/>
         <w:rPr>
           <w:sz w:val="28"/>
         </w:rPr>
@@ -5619,7 +5935,7 @@
     </w:p>
     <w:p>
       <w:pPr>
-        <w:pStyle w:val="a3"/>
+        <w:pStyle w:val="NormalWeb"/>
         <w:rPr>
           <w:sz w:val="28"/>
         </w:rPr>
@@ -5633,14 +5949,14 @@
     </w:p>
     <w:p>
       <w:pPr>
-        <w:pStyle w:val="a3"/>
-        <w:rPr>
-          <w:sz w:val="28"/>
-        </w:rPr>
-      </w:pPr>
-      <w:r>
-        <w:rPr>
-          <w:rStyle w:val="a4"/>
+        <w:pStyle w:val="NormalWeb"/>
+        <w:rPr>
+          <w:sz w:val="28"/>
+        </w:rPr>
+      </w:pPr>
+      <w:r>
+        <w:rPr>
+          <w:rStyle w:val="Strong"/>
           <w:sz w:val="28"/>
         </w:rPr>
         <w:t>Table 1-6. Common Sources of Engineering Evidence</w:t>
@@ -5693,6 +6009,7 @@
                 <w:bCs/>
                 <w:szCs w:val="20"/>
               </w:rPr>
+              <w:lastRenderedPageBreak/>
               <w:t>Evidence Source</w:t>
             </w:r>
           </w:p>
@@ -5878,7 +6195,6 @@
               <w:rPr>
                 <w:szCs w:val="20"/>
               </w:rPr>
-              <w:lastRenderedPageBreak/>
               <w:t>Peer-reviewed research papers</w:t>
             </w:r>
           </w:p>
@@ -6287,7 +6603,7 @@
     </w:tbl>
     <w:p>
       <w:pPr>
-        <w:pStyle w:val="a3"/>
+        <w:pStyle w:val="NormalWeb"/>
         <w:rPr>
           <w:sz w:val="28"/>
         </w:rPr>
@@ -6301,42 +6617,56 @@
     </w:p>
     <w:p>
       <w:pPr>
-        <w:pStyle w:val="a3"/>
-        <w:rPr>
-          <w:sz w:val="28"/>
-        </w:rPr>
-      </w:pPr>
-      <w:r>
-        <w:rPr>
-          <w:sz w:val="28"/>
-        </w:rPr>
-        <w:t>Another important principle is reproducibility. Claims supported by publicly documented methodology, repeatable experiments, and independent verification generally deserve greater confidence than isolated demonstrations or unpublished internal testing. Technologies that consistently demonstrate similar behavior across multiple independent evaluations inspire greater confidence than those supported primarily by vendor-generated evidence.</w:t>
-      </w:r>
-    </w:p>
-    <w:p>
-      <w:pPr>
-        <w:pStyle w:val="a3"/>
-        <w:rPr>
-          <w:sz w:val="28"/>
-        </w:rPr>
-      </w:pPr>
-      <w:r>
-        <w:rPr>
-          <w:sz w:val="28"/>
-        </w:rPr>
-        <w:t>Throughout this book, references are selected according to this philosophy. Preference is given to official documentation for supported functionality, peer-</w:t>
+        <w:pStyle w:val="NormalWeb"/>
+        <w:rPr>
+          <w:sz w:val="28"/>
+        </w:rPr>
+      </w:pPr>
+      <w:r>
+        <w:rPr>
+          <w:sz w:val="28"/>
+        </w:rPr>
+        <w:t xml:space="preserve">Another important principle is reproducibility. Claims supported by publicly documented methodology, repeatable experiments, and independent verification generally deserve greater confidence than isolated demonstrations or unpublished internal testing. Technologies that consistently demonstrate similar behavior across </w:t>
       </w:r>
       <w:r>
         <w:rPr>
           <w:sz w:val="28"/>
         </w:rPr>
         <w:lastRenderedPageBreak/>
-        <w:t>reviewed research for conceptual foundations, standardized benchmarks for comparative evaluation, and engineering publications describing production operational experience. Marketing materials and promotional content are used only when they contain technically relevant information unavailable elsewhere, and even then they are interpreted cautiously.</w:t>
-      </w:r>
-    </w:p>
-    <w:p>
-      <w:pPr>
-        <w:pStyle w:val="a3"/>
+        <w:t>multiple independent evaluations inspire greater confidence than those supported primarily by vendor-generated evidence.</w:t>
+      </w:r>
+    </w:p>
+    <w:p>
+      <w:pPr>
+        <w:pStyle w:val="NormalWeb"/>
+        <w:rPr>
+          <w:sz w:val="28"/>
+        </w:rPr>
+      </w:pPr>
+      <w:r>
+        <w:rPr>
+          <w:sz w:val="28"/>
+        </w:rPr>
+        <w:t xml:space="preserve">Throughout this book, references are selected according to this philosophy. Preference is given to official documentation for supported functionality, peer-reviewed research for conceptual foundations, standardized benchmarks for comparative evaluation, and engineering publications describing production operational experience. Marketing materials and promotional content are used only when they contain technically relevant information unavailable elsewhere, and even </w:t>
+      </w:r>
+      <w:proofErr w:type="gramStart"/>
+      <w:r>
+        <w:rPr>
+          <w:sz w:val="28"/>
+        </w:rPr>
+        <w:t>then</w:t>
+      </w:r>
+      <w:proofErr w:type="gramEnd"/>
+      <w:r>
+        <w:rPr>
+          <w:sz w:val="28"/>
+        </w:rPr>
+        <w:t xml:space="preserve"> they are interpreted cautiously.</w:t>
+      </w:r>
+    </w:p>
+    <w:p>
+      <w:pPr>
+        <w:pStyle w:val="NormalWeb"/>
         <w:rPr>
           <w:sz w:val="28"/>
         </w:rPr>
@@ -6365,7 +6695,7 @@
     </w:p>
     <w:p>
       <w:pPr>
-        <w:pStyle w:val="1"/>
+        <w:pStyle w:val="Heading1"/>
         <w:rPr>
           <w:sz w:val="52"/>
         </w:rPr>
@@ -6379,7 +6709,7 @@
     </w:p>
     <w:p>
       <w:pPr>
-        <w:pStyle w:val="a3"/>
+        <w:pStyle w:val="NormalWeb"/>
         <w:rPr>
           <w:sz w:val="28"/>
         </w:rPr>
@@ -6393,7 +6723,7 @@
     </w:p>
     <w:p>
       <w:pPr>
-        <w:pStyle w:val="a3"/>
+        <w:pStyle w:val="NormalWeb"/>
         <w:rPr>
           <w:sz w:val="28"/>
         </w:rPr>
@@ -6407,42 +6737,42 @@
     </w:p>
     <w:p>
       <w:pPr>
-        <w:pStyle w:val="a3"/>
-        <w:rPr>
-          <w:sz w:val="28"/>
-        </w:rPr>
-      </w:pPr>
-      <w:r>
-        <w:rPr>
-          <w:sz w:val="28"/>
-        </w:rPr>
-        <w:t>Every benchmark is designed to evaluate specific characteristics. Some measure general language understanding, others assess mathematical reasoning, software engineering capability, factual knowledge, retrieval effectiveness, or multimodal performance. Infrastructure benchmarks evaluate different properties, including inference latency, throughput, accelerator utilization, memory efficiency, or energy consumption. No single benchmark captures the full range of capabilities required by production AI systems.</w:t>
-      </w:r>
-    </w:p>
-    <w:p>
-      <w:pPr>
-        <w:pStyle w:val="a3"/>
-        <w:rPr>
-          <w:sz w:val="28"/>
-        </w:rPr>
-      </w:pPr>
-      <w:r>
-        <w:rPr>
-          <w:sz w:val="28"/>
-        </w:rPr>
-        <w:t xml:space="preserve">This distinction becomes particularly important when comparing language models. A model achieving state-of-the-art performance on mathematical reasoning may provide limited advantages for document summarization or customer support. </w:t>
+        <w:pStyle w:val="NormalWeb"/>
+        <w:rPr>
+          <w:sz w:val="28"/>
+        </w:rPr>
+      </w:pPr>
+      <w:r>
+        <w:rPr>
+          <w:sz w:val="28"/>
+        </w:rPr>
+        <w:t xml:space="preserve">Every benchmark is designed to evaluate specific characteristics. Some measure general language understanding, others assess mathematical reasoning, software engineering capability, factual knowledge, retrieval effectiveness, or multimodal performance. Infrastructure benchmarks evaluate different properties, including inference latency, throughput, accelerator utilization, memory efficiency, or energy </w:t>
       </w:r>
       <w:r>
         <w:rPr>
           <w:sz w:val="28"/>
         </w:rPr>
         <w:lastRenderedPageBreak/>
-        <w:t>Similarly, a model optimized for long-context processing may exhibit higher inference costs or latency than smaller alternatives better suited to interactive applications. Benchmark results should therefore always be interpreted within the context of the intended workload.</w:t>
-      </w:r>
-    </w:p>
-    <w:p>
-      <w:pPr>
-        <w:pStyle w:val="a3"/>
+        <w:t>consumption. No single benchmark captures the full range of capabilities required by production AI systems.</w:t>
+      </w:r>
+    </w:p>
+    <w:p>
+      <w:pPr>
+        <w:pStyle w:val="NormalWeb"/>
+        <w:rPr>
+          <w:sz w:val="28"/>
+        </w:rPr>
+      </w:pPr>
+      <w:r>
+        <w:rPr>
+          <w:sz w:val="28"/>
+        </w:rPr>
+        <w:t>This distinction becomes particularly important when comparing language models. A model achieving state-of-the-art performance on mathematical reasoning may provide limited advantages for document summarization or customer support. Similarly, a model optimized for long-context processing may exhibit higher inference costs or latency than smaller alternatives better suited to interactive applications. Benchmark results should therefore always be interpreted within the context of the intended workload.</w:t>
+      </w:r>
+    </w:p>
+    <w:p>
+      <w:pPr>
+        <w:pStyle w:val="NormalWeb"/>
         <w:rPr>
           <w:sz w:val="28"/>
         </w:rPr>
@@ -6539,7 +6869,25 @@
           <w:sz w:val="28"/>
           <w:szCs w:val="24"/>
         </w:rPr>
-        <w:t xml:space="preserve">Does the benchmark measure first-attempt accuracy, pass@k performance, or human preference? </w:t>
+        <w:t xml:space="preserve">Does the benchmark measure first-attempt accuracy, </w:t>
+      </w:r>
+      <w:proofErr w:type="spellStart"/>
+      <w:r>
+        <w:rPr>
+          <w:rFonts w:ascii="Times New Roman" w:hAnsi="Times New Roman" w:cs="Times New Roman"/>
+          <w:sz w:val="28"/>
+          <w:szCs w:val="24"/>
+        </w:rPr>
+        <w:t>pass@k</w:t>
+      </w:r>
+      <w:proofErr w:type="spellEnd"/>
+      <w:r>
+        <w:rPr>
+          <w:rFonts w:ascii="Times New Roman" w:hAnsi="Times New Roman" w:cs="Times New Roman"/>
+          <w:sz w:val="28"/>
+          <w:szCs w:val="24"/>
+        </w:rPr>
+        <w:t xml:space="preserve"> performance, or human preference? </w:t>
       </w:r>
     </w:p>
     <w:p>
@@ -6610,7 +6958,7 @@
     </w:p>
     <w:p>
       <w:pPr>
-        <w:pStyle w:val="a3"/>
+        <w:pStyle w:val="NormalWeb"/>
         <w:rPr>
           <w:sz w:val="28"/>
         </w:rPr>
@@ -6624,7 +6972,7 @@
     </w:p>
     <w:p>
       <w:pPr>
-        <w:pStyle w:val="a3"/>
+        <w:pStyle w:val="NormalWeb"/>
         <w:rPr>
           <w:sz w:val="28"/>
         </w:rPr>
@@ -6638,28 +6986,35 @@
     </w:p>
     <w:p>
       <w:pPr>
-        <w:pStyle w:val="a3"/>
-        <w:rPr>
-          <w:sz w:val="28"/>
-        </w:rPr>
-      </w:pPr>
-      <w:r>
-        <w:rPr>
-          <w:sz w:val="28"/>
-        </w:rPr>
-        <w:t>The growing diversity of benchmarks also reflects the increasing specialization of AI systems. General-purpose language understanding benchmarks remain valuable, but production platforms increasingly rely on domain-specific evaluations. Coding assistants are commonly assessed using software engineering benchmarks. Retrieval systems require retrieval-specific evaluation datasets. Agent frameworks increasingly measure task completion across multi-step workflows rather than isolated prompt-response interactions. Infrastructure teams focus on latency, throughput, reliability, and operational efficiency rather than language quality alone.</w:t>
-      </w:r>
-    </w:p>
-    <w:p>
-      <w:pPr>
-        <w:pStyle w:val="a3"/>
-        <w:rPr>
-          <w:sz w:val="28"/>
-        </w:rPr>
-      </w:pPr>
-      <w:r>
-        <w:rPr>
-          <w:rStyle w:val="a4"/>
+        <w:pStyle w:val="NormalWeb"/>
+        <w:rPr>
+          <w:sz w:val="28"/>
+        </w:rPr>
+      </w:pPr>
+      <w:r>
+        <w:rPr>
+          <w:sz w:val="28"/>
+        </w:rPr>
+        <w:t xml:space="preserve">The growing diversity of benchmarks also reflects the increasing specialization of AI systems. General-purpose language understanding benchmarks remain valuable, but production platforms increasingly rely on domain-specific evaluations. Coding assistants are commonly assessed using software engineering benchmarks. Retrieval systems require retrieval-specific evaluation datasets. Agent frameworks increasingly measure task completion across multi-step workflows rather than isolated prompt-response interactions. Infrastructure teams focus on latency, </w:t>
+      </w:r>
+      <w:r>
+        <w:rPr>
+          <w:sz w:val="28"/>
+        </w:rPr>
+        <w:lastRenderedPageBreak/>
+        <w:t>throughput, reliability, and operational efficiency rather than language quality alone.</w:t>
+      </w:r>
+    </w:p>
+    <w:p>
+      <w:pPr>
+        <w:pStyle w:val="NormalWeb"/>
+        <w:rPr>
+          <w:sz w:val="28"/>
+        </w:rPr>
+      </w:pPr>
+      <w:r>
+        <w:rPr>
+          <w:rStyle w:val="Strong"/>
           <w:sz w:val="28"/>
         </w:rPr>
         <w:t>Table 1-7. Representative Benchmark Categories</w:t>
@@ -6712,7 +7067,6 @@
                 <w:bCs/>
                 <w:szCs w:val="20"/>
               </w:rPr>
-              <w:lastRenderedPageBreak/>
               <w:t>Benchmark Category</w:t>
             </w:r>
           </w:p>
@@ -7019,12 +7373,28 @@
                 <w:szCs w:val="20"/>
               </w:rPr>
             </w:pPr>
+            <w:proofErr w:type="spellStart"/>
             <w:r>
               <w:rPr>
                 <w:szCs w:val="20"/>
               </w:rPr>
-              <w:t>HumanEval, SWE-bench, LiveCodeBench</w:t>
-            </w:r>
+              <w:t>HumanEval</w:t>
+            </w:r>
+            <w:proofErr w:type="spellEnd"/>
+            <w:r>
+              <w:rPr>
+                <w:szCs w:val="20"/>
+              </w:rPr>
+              <w:t xml:space="preserve">, SWE-bench, </w:t>
+            </w:r>
+            <w:proofErr w:type="spellStart"/>
+            <w:r>
+              <w:rPr>
+                <w:szCs w:val="20"/>
+              </w:rPr>
+              <w:t>LiveCodeBench</w:t>
+            </w:r>
+            <w:proofErr w:type="spellEnd"/>
           </w:p>
         </w:tc>
         <w:tc>
@@ -7274,11 +7644,19 @@
                 <w:szCs w:val="20"/>
               </w:rPr>
             </w:pPr>
+            <w:proofErr w:type="spellStart"/>
             <w:r>
               <w:rPr>
                 <w:szCs w:val="20"/>
               </w:rPr>
-              <w:t>MLPerf Inference</w:t>
+              <w:t>MLPerf</w:t>
+            </w:r>
+            <w:proofErr w:type="spellEnd"/>
+            <w:r>
+              <w:rPr>
+                <w:szCs w:val="20"/>
+              </w:rPr>
+              <w:t xml:space="preserve"> Inference</w:t>
             </w:r>
           </w:p>
         </w:tc>
@@ -7306,7 +7684,7 @@
     </w:tbl>
     <w:p>
       <w:pPr>
-        <w:pStyle w:val="a3"/>
+        <w:pStyle w:val="NormalWeb"/>
         <w:rPr>
           <w:sz w:val="28"/>
         </w:rPr>
@@ -7320,36 +7698,42 @@
     </w:p>
     <w:p>
       <w:pPr>
-        <w:pStyle w:val="a3"/>
-        <w:rPr>
-          <w:sz w:val="28"/>
-        </w:rPr>
-      </w:pPr>
-      <w:r>
-        <w:rPr>
-          <w:sz w:val="28"/>
-        </w:rPr>
-        <w:t>For this reason, mature organizations supplement public benchmarks with internal evaluation datasets representing their own business requirements. Customer support systems evaluate real support conversations. Document processing platforms assess representative enterprise documents. Software engineering assistants test against internal codebases. These evaluations often provide more actionable information than generic public benchmarks because they directly reflect production workloads.</w:t>
-      </w:r>
-    </w:p>
-    <w:p>
-      <w:pPr>
-        <w:pStyle w:val="a3"/>
-        <w:rPr>
-          <w:sz w:val="28"/>
-        </w:rPr>
-      </w:pPr>
+        <w:pStyle w:val="NormalWeb"/>
+        <w:rPr>
+          <w:sz w:val="28"/>
+        </w:rPr>
+      </w:pPr>
+      <w:r>
+        <w:rPr>
+          <w:sz w:val="28"/>
+        </w:rPr>
+        <w:t xml:space="preserve">For this reason, mature organizations supplement public benchmarks with internal evaluation datasets representing their own business requirements. Customer </w:t>
+      </w:r>
       <w:r>
         <w:rPr>
           <w:sz w:val="28"/>
         </w:rPr>
         <w:lastRenderedPageBreak/>
+        <w:t>support systems evaluate real support conversations. Document processing platforms assess representative enterprise documents. Software engineering assistants test against internal codebases. These evaluations often provide more actionable information than generic public benchmarks because they directly reflect production workloads.</w:t>
+      </w:r>
+    </w:p>
+    <w:p>
+      <w:pPr>
+        <w:pStyle w:val="NormalWeb"/>
+        <w:rPr>
+          <w:sz w:val="28"/>
+        </w:rPr>
+      </w:pPr>
+      <w:r>
+        <w:rPr>
+          <w:sz w:val="28"/>
+        </w:rPr>
         <w:t>Finally, benchmark rankings should be interpreted as snapshots rather than permanent truths. The rapid pace of model development means that leaderboard positions can change within weeks or months. Engineering decisions, however, often remain in place for years. Consequently, benchmark results should inform architectural decisions but rarely determine them in isolation. Long-term considerations such as deployment flexibility, operational maturity, security, governance, ecosystem support, and total cost of ownership frequently exert greater influence on production success than marginal improvements in benchmark performance.</w:t>
       </w:r>
     </w:p>
     <w:p>
       <w:pPr>
-        <w:pStyle w:val="a3"/>
+        <w:pStyle w:val="NormalWeb"/>
         <w:rPr>
           <w:sz w:val="28"/>
         </w:rPr>
@@ -7455,6 +7839,7 @@
           <w:sz w:val="28"/>
           <w:szCs w:val="24"/>
         </w:rPr>
+        <w:lastRenderedPageBreak/>
         <w:t xml:space="preserve">One important dimension is </w:t>
       </w:r>
       <w:r>
@@ -7491,7 +7876,6 @@
           <w:sz w:val="28"/>
           <w:szCs w:val="24"/>
         </w:rPr>
-        <w:lastRenderedPageBreak/>
         <w:t xml:space="preserve">A second dimension is </w:t>
       </w:r>
       <w:r>
@@ -7584,6 +7968,7 @@
           <w:sz w:val="28"/>
           <w:szCs w:val="24"/>
         </w:rPr>
+        <w:lastRenderedPageBreak/>
         <w:t>Table 1-8. Common Indicators of Technology Maturity</w:t>
       </w:r>
     </w:p>
@@ -7794,7 +8179,6 @@
                 <w:rFonts w:ascii="Times New Roman" w:eastAsia="Times New Roman" w:hAnsi="Times New Roman" w:cs="Times New Roman"/>
                 <w:sz w:val="24"/>
               </w:rPr>
-              <w:lastRenderedPageBreak/>
               <w:t>Operational experience</w:t>
             </w:r>
           </w:p>
@@ -8268,7 +8652,16 @@
           <w:sz w:val="28"/>
           <w:szCs w:val="24"/>
         </w:rPr>
-        <w:t>This principle extends beyond software. Emerging hardware architectures, accelerator technologies, networking standards, and deployment models should be evaluated according to the same engineering criteria. Novel capabilities become valuable only when they can be integrated into operational systems with acceptable levels of reliability, maintainability, and support.</w:t>
+        <w:t xml:space="preserve">This principle extends beyond software. Emerging hardware architectures, accelerator technologies, networking standards, and deployment models should be evaluated according to the same engineering criteria. Novel capabilities become </w:t>
+      </w:r>
+      <w:r>
+        <w:rPr>
+          <w:rFonts w:ascii="Times New Roman" w:eastAsia="Times New Roman" w:hAnsi="Times New Roman" w:cs="Times New Roman"/>
+          <w:sz w:val="28"/>
+          <w:szCs w:val="24"/>
+        </w:rPr>
+        <w:lastRenderedPageBreak/>
+        <w:t>valuable only when they can be integrated into operational systems with acceptable levels of reliability, maintainability, and support.</w:t>
       </w:r>
     </w:p>
     <w:p>
@@ -8286,7 +8679,6 @@
           <w:sz w:val="28"/>
           <w:szCs w:val="24"/>
         </w:rPr>
-        <w:lastRenderedPageBreak/>
         <w:t>Throughout this book, technologies are therefore discussed within the context of their current engineering maturity. Established industry practices are distinguished from rapidly evolving techniques, and experimental approaches are clearly identified where appropriate. This distinction enables readers to make informed architectural decisions based not only on technical capability but also on operational readiness.</w:t>
       </w:r>
     </w:p>
@@ -8422,7 +8814,16 @@
           <w:sz w:val="28"/>
           <w:szCs w:val="24"/>
         </w:rPr>
-        <w:t>Distributed systems principles continue to govern service communication. Authentication and authorization remain essential regardless of the selected model provider. Deployment automation, infrastructure as code, observability, version control, continuous integration, and operational governance remain indispensable for production environments. These principles were established before the emergence of generative AI and continue to provide the foundation upon which AI platforms are built.</w:t>
+        <w:t xml:space="preserve">Distributed systems principles continue to govern service communication. Authentication and authorization remain essential regardless of the selected model provider. Deployment automation, infrastructure as code, observability, version control, continuous integration, and operational governance remain indispensable for production environments. These principles were established before the </w:t>
+      </w:r>
+      <w:r>
+        <w:rPr>
+          <w:rFonts w:ascii="Times New Roman" w:eastAsia="Times New Roman" w:hAnsi="Times New Roman" w:cs="Times New Roman"/>
+          <w:sz w:val="28"/>
+          <w:szCs w:val="24"/>
+        </w:rPr>
+        <w:lastRenderedPageBreak/>
+        <w:t>emergence of generative AI and continue to provide the foundation upon which AI platforms are built.</w:t>
       </w:r>
     </w:p>
     <w:p>
@@ -8440,7 +8841,6 @@
           <w:sz w:val="28"/>
           <w:szCs w:val="24"/>
         </w:rPr>
-        <w:lastRenderedPageBreak/>
         <w:t>By contrast, many AI-specific technologies remain in periods of rapid evolution. Foundation models continue to improve in capability and efficiency. Inference engines regularly introduce new scheduling algorithms and optimization techniques. Agent frameworks compete to define programming abstractions for autonomous workflows. Evaluation methodologies evolve alongside increasingly capable reasoning models. Context engineering, prompt optimization, and retrieval strategies continue to mature as operational experience grows.</w:t>
       </w:r>
     </w:p>
@@ -8873,6 +9273,7 @@
                 <w:rFonts w:ascii="Times New Roman" w:eastAsia="Times New Roman" w:hAnsi="Times New Roman" w:cs="Times New Roman"/>
                 <w:sz w:val="24"/>
               </w:rPr>
+              <w:lastRenderedPageBreak/>
               <w:t>Observability frameworks</w:t>
             </w:r>
           </w:p>
@@ -9021,7 +9422,6 @@
                 <w:rFonts w:ascii="Times New Roman" w:eastAsia="Times New Roman" w:hAnsi="Times New Roman" w:cs="Times New Roman"/>
                 <w:sz w:val="24"/>
               </w:rPr>
-              <w:lastRenderedPageBreak/>
               <w:t>Inference engines</w:t>
             </w:r>
           </w:p>
@@ -9356,6 +9756,7 @@
           <w:sz w:val="28"/>
           <w:szCs w:val="24"/>
         </w:rPr>
+        <w:lastRenderedPageBreak/>
         <w:t>Part I, Foundations and Platform Strategy</w:t>
       </w:r>
       <w:r>
@@ -9364,16 +9765,7 @@
           <w:sz w:val="28"/>
           <w:szCs w:val="24"/>
         </w:rPr>
-        <w:t xml:space="preserve">, establishes the architectural perspective adopted throughout the book. In addition to defining the scope of AI Platform Engineering, it examines technology selection, reference architectures, </w:t>
-      </w:r>
-      <w:r>
-        <w:rPr>
-          <w:rFonts w:ascii="Times New Roman" w:eastAsia="Times New Roman" w:hAnsi="Times New Roman" w:cs="Times New Roman"/>
-          <w:sz w:val="28"/>
-          <w:szCs w:val="24"/>
-        </w:rPr>
-        <w:lastRenderedPageBreak/>
-        <w:t>and the engineering trade-offs involved in designing AI platforms under different organizational constraints.</w:t>
+        <w:t>, establishes the architectural perspective adopted throughout the book. In addition to defining the scope of AI Platform Engineering, it examines technology selection, reference architectures, and the engineering trade-offs involved in designing AI platforms under different organizational constraints.</w:t>
       </w:r>
     </w:p>
     <w:p>
@@ -9561,6 +9953,7 @@
           <w:sz w:val="28"/>
           <w:szCs w:val="24"/>
         </w:rPr>
+        <w:lastRenderedPageBreak/>
         <w:t>Part VIII, Platform Evolution</w:t>
       </w:r>
       <w:r>
@@ -9569,16 +9962,7 @@
           <w:sz w:val="28"/>
           <w:szCs w:val="24"/>
         </w:rPr>
-        <w:t xml:space="preserve">, concludes the book by examining how AI platforms remain sustainable as technologies evolve. Topics include technology lifecycle management, migration planning, architectural modernization, </w:t>
-      </w:r>
-      <w:r>
-        <w:rPr>
-          <w:rFonts w:ascii="Times New Roman" w:eastAsia="Times New Roman" w:hAnsi="Times New Roman" w:cs="Times New Roman"/>
-          <w:sz w:val="28"/>
-          <w:szCs w:val="24"/>
-        </w:rPr>
-        <w:lastRenderedPageBreak/>
-        <w:t>dependency management, and maintaining a long-term technology radar for rapidly changing ecosystems.</w:t>
+        <w:t>, concludes the book by examining how AI platforms remain sustainable as technologies evolve. Topics include technology lifecycle management, migration planning, architectural modernization, dependency management, and maintaining a long-term technology radar for rapidly changing ecosystems.</w:t>
       </w:r>
     </w:p>
     <w:p>
@@ -9857,7 +10241,16 @@
           <w:sz w:val="28"/>
           <w:szCs w:val="24"/>
         </w:rPr>
-        <w:t xml:space="preserve"> examine orchestration frameworks, agent systems, durable workflows, and execution models for complex AI applications.</w:t>
+        <w:t xml:space="preserve"> </w:t>
+      </w:r>
+      <w:r>
+        <w:rPr>
+          <w:rFonts w:ascii="Times New Roman" w:eastAsia="Times New Roman" w:hAnsi="Times New Roman" w:cs="Times New Roman"/>
+          <w:sz w:val="28"/>
+          <w:szCs w:val="24"/>
+        </w:rPr>
+        <w:lastRenderedPageBreak/>
+        <w:t>examine orchestration frameworks, agent systems, durable workflows, and execution models for complex AI applications.</w:t>
       </w:r>
     </w:p>
     <w:p>
@@ -9875,7 +10268,6 @@
           <w:sz w:val="28"/>
           <w:szCs w:val="24"/>
         </w:rPr>
-        <w:lastRenderedPageBreak/>
         <w:t xml:space="preserve">The information layer supporting enterprise AI applications forms the subject of </w:t>
       </w:r>
       <w:r>
@@ -9980,7 +10372,7 @@
 </file>
 
 <file path=word/numbering.xml><?xml version="1.0" encoding="utf-8"?>
-<w:numbering xmlns:wpc="http://schemas.microsoft.com/office/word/2010/wordprocessingCanvas" xmlns:cx="http://schemas.microsoft.com/office/drawing/2014/chartex" xmlns:cx1="http://schemas.microsoft.com/office/drawing/2015/9/8/chartex" xmlns:cx2="http://schemas.microsoft.com/office/drawing/2015/10/21/chartex" xmlns:cx3="http://schemas.microsoft.com/office/drawing/2016/5/9/chartex" xmlns:cx4="http://schemas.microsoft.com/office/drawing/2016/5/10/chartex" xmlns:cx5="http://schemas.microsoft.com/office/drawing/2016/5/11/chartex" xmlns:cx6="http://schemas.microsoft.com/office/drawing/2016/5/12/chartex" xmlns:cx7="http://schemas.microsoft.com/office/drawing/2016/5/13/chartex" xmlns:cx8="http://schemas.microsoft.com/office/drawing/2016/5/14/chartex" xmlns:mc="http://schemas.openxmlformats.org/markup-compatibility/2006" xmlns:aink="http://schemas.microsoft.com/office/drawing/2016/ink" xmlns:am3d="http://schemas.microsoft.com/office/drawing/2017/model3d" xmlns:o="urn:schemas-microsoft-com:office:office" xmlns:r="http://schemas.openxmlformats.org/officeDocument/2006/relationships" xmlns:m="http://schemas.openxmlformats.org/officeDocument/2006/math" xmlns:v="urn:schemas-microsoft-com:vml" xmlns:wp14="http://schemas.microsoft.com/office/word/2010/wordprocessingDrawing" xmlns:wp="http://schemas.openxmlformats.org/drawingml/2006/wordprocessingDrawing" xmlns:w10="urn:schemas-microsoft-com:office:word" xmlns:w="http://schemas.openxmlformats.org/wordprocessingml/2006/main" xmlns:w14="http://schemas.microsoft.com/office/word/2010/wordml" xmlns:w15="http://schemas.microsoft.com/office/word/2012/wordml" xmlns:w16cex="http://schemas.microsoft.com/office/word/2018/wordml/cex" xmlns:w16cid="http://schemas.microsoft.com/office/word/2016/wordml/cid" xmlns:w16="http://schemas.microsoft.com/office/word/2018/wordml" xmlns:w16sdtdh="http://schemas.microsoft.com/office/word/2020/wordml/sdtdatahash" xmlns:w16se="http://schemas.microsoft.com/office/word/2015/wordml/symex" xmlns:wpg="http://schemas.microsoft.com/office/word/2010/wordprocessingGroup" xmlns:wpi="http://schemas.microsoft.com/office/word/2010/wordprocessingInk" xmlns:wne="http://schemas.microsoft.com/office/word/2006/wordml" xmlns:wps="http://schemas.microsoft.com/office/word/2010/wordprocessingShape" mc:Ignorable="w14 w15 w16se w16cid w16 w16cex w16sdtdh wp14">
+<w:numbering xmlns:wpc="http://schemas.microsoft.com/office/word/2010/wordprocessingCanvas" xmlns:cx="http://schemas.microsoft.com/office/drawing/2014/chartex" xmlns:cx1="http://schemas.microsoft.com/office/drawing/2015/9/8/chartex" xmlns:cx2="http://schemas.microsoft.com/office/drawing/2015/10/21/chartex" xmlns:cx3="http://schemas.microsoft.com/office/drawing/2016/5/9/chartex" xmlns:cx4="http://schemas.microsoft.com/office/drawing/2016/5/10/chartex" xmlns:cx5="http://schemas.microsoft.com/office/drawing/2016/5/11/chartex" xmlns:cx6="http://schemas.microsoft.com/office/drawing/2016/5/12/chartex" xmlns:cx7="http://schemas.microsoft.com/office/drawing/2016/5/13/chartex" xmlns:cx8="http://schemas.microsoft.com/office/drawing/2016/5/14/chartex" xmlns:mc="http://schemas.openxmlformats.org/markup-compatibility/2006" xmlns:aink="http://schemas.microsoft.com/office/drawing/2016/ink" xmlns:am3d="http://schemas.microsoft.com/office/drawing/2017/model3d" xmlns:o="urn:schemas-microsoft-com:office:office" xmlns:r="http://schemas.openxmlformats.org/officeDocument/2006/relationships" xmlns:m="http://schemas.openxmlformats.org/officeDocument/2006/math" xmlns:v="urn:schemas-microsoft-com:vml" xmlns:wp14="http://schemas.microsoft.com/office/word/2010/wordprocessingDrawing" xmlns:wp="http://schemas.openxmlformats.org/drawingml/2006/wordprocessingDrawing" xmlns:w10="urn:schemas-microsoft-com:office:word" xmlns:w="http://schemas.openxmlformats.org/wordprocessingml/2006/main" xmlns:w14="http://schemas.microsoft.com/office/word/2010/wordml" xmlns:w15="http://schemas.microsoft.com/office/word/2012/wordml" xmlns:w16cid="http://schemas.microsoft.com/office/word/2016/wordml/cid" xmlns:w16se="http://schemas.microsoft.com/office/word/2015/wordml/symex" xmlns:wpg="http://schemas.microsoft.com/office/word/2010/wordprocessingGroup" xmlns:wpi="http://schemas.microsoft.com/office/word/2010/wordprocessingInk" xmlns:wne="http://schemas.microsoft.com/office/word/2006/wordml" xmlns:wps="http://schemas.microsoft.com/office/word/2010/wordprocessingShape" mc:Ignorable="w14 w15 w16se w16cid wp14">
   <w:abstractNum w:abstractNumId="0" w15:restartNumberingAfterBreak="0">
     <w:nsid w:val="04404998"/>
     <w:multiLevelType w:val="multilevel"/>
@@ -12142,7 +12534,7 @@
 </file>
 
 <file path=word/styles.xml><?xml version="1.0" encoding="utf-8"?>
-<w:styles xmlns:mc="http://schemas.openxmlformats.org/markup-compatibility/2006" xmlns:r="http://schemas.openxmlformats.org/officeDocument/2006/relationships" xmlns:w="http://schemas.openxmlformats.org/wordprocessingml/2006/main" xmlns:w14="http://schemas.microsoft.com/office/word/2010/wordml" xmlns:w15="http://schemas.microsoft.com/office/word/2012/wordml" xmlns:w16cex="http://schemas.microsoft.com/office/word/2018/wordml/cex" xmlns:w16cid="http://schemas.microsoft.com/office/word/2016/wordml/cid" xmlns:w16="http://schemas.microsoft.com/office/word/2018/wordml" xmlns:w16sdtdh="http://schemas.microsoft.com/office/word/2020/wordml/sdtdatahash" xmlns:w16se="http://schemas.microsoft.com/office/word/2015/wordml/symex" mc:Ignorable="w14 w15 w16se w16cid w16 w16cex w16sdtdh">
+<w:styles xmlns:mc="http://schemas.openxmlformats.org/markup-compatibility/2006" xmlns:r="http://schemas.openxmlformats.org/officeDocument/2006/relationships" xmlns:w="http://schemas.openxmlformats.org/wordprocessingml/2006/main" xmlns:w14="http://schemas.microsoft.com/office/word/2010/wordml" xmlns:w15="http://schemas.microsoft.com/office/word/2012/wordml" xmlns:w16cid="http://schemas.microsoft.com/office/word/2016/wordml/cid" xmlns:w16se="http://schemas.microsoft.com/office/word/2015/wordml/symex" mc:Ignorable="w14 w15 w16se w16cid">
   <w:docDefaults>
     <w:rPrDefault>
       <w:rPr>
@@ -12158,7 +12550,7 @@
       </w:pPr>
     </w:pPrDefault>
   </w:docDefaults>
-  <w:latentStyles w:defLockedState="0" w:defUIPriority="99" w:defSemiHidden="0" w:defUnhideWhenUsed="0" w:defQFormat="0" w:count="376">
+  <w:latentStyles w:defLockedState="0" w:defUIPriority="99" w:defSemiHidden="0" w:defUnhideWhenUsed="0" w:defQFormat="0" w:count="375">
     <w:lsdException w:name="Normal" w:uiPriority="0" w:qFormat="1"/>
     <w:lsdException w:name="heading 1" w:uiPriority="9" w:qFormat="1"/>
     <w:lsdException w:name="heading 2" w:semiHidden="1" w:uiPriority="9" w:unhideWhenUsed="1" w:qFormat="1"/>
@@ -12534,16 +12926,15 @@
     <w:lsdException w:name="Smart Hyperlink" w:semiHidden="1" w:unhideWhenUsed="1"/>
     <w:lsdException w:name="Hashtag" w:semiHidden="1" w:unhideWhenUsed="1"/>
     <w:lsdException w:name="Unresolved Mention" w:semiHidden="1" w:unhideWhenUsed="1"/>
-    <w:lsdException w:name="Smart Link" w:semiHidden="1" w:unhideWhenUsed="1"/>
   </w:latentStyles>
-  <w:style w:type="paragraph" w:default="1" w:styleId="a">
+  <w:style w:type="paragraph" w:default="1" w:styleId="Normal">
     <w:name w:val="Normal"/>
     <w:qFormat/>
   </w:style>
-  <w:style w:type="paragraph" w:styleId="1">
+  <w:style w:type="paragraph" w:styleId="Heading1">
     <w:name w:val="heading 1"/>
-    <w:basedOn w:val="a"/>
-    <w:link w:val="10"/>
+    <w:basedOn w:val="Normal"/>
+    <w:link w:val="Heading1Char"/>
     <w:uiPriority w:val="9"/>
     <w:qFormat/>
     <w:rsid w:val="00D80B45"/>
@@ -12560,11 +12951,11 @@
       <w:szCs w:val="48"/>
     </w:rPr>
   </w:style>
-  <w:style w:type="paragraph" w:styleId="2">
+  <w:style w:type="paragraph" w:styleId="Heading2">
     <w:name w:val="heading 2"/>
-    <w:basedOn w:val="a"/>
-    <w:next w:val="a"/>
-    <w:link w:val="20"/>
+    <w:basedOn w:val="Normal"/>
+    <w:next w:val="Normal"/>
+    <w:link w:val="Heading2Char"/>
     <w:uiPriority w:val="9"/>
     <w:semiHidden/>
     <w:unhideWhenUsed/>
@@ -12583,11 +12974,11 @@
       <w:szCs w:val="26"/>
     </w:rPr>
   </w:style>
-  <w:style w:type="paragraph" w:styleId="3">
+  <w:style w:type="paragraph" w:styleId="Heading3">
     <w:name w:val="heading 3"/>
-    <w:basedOn w:val="a"/>
-    <w:next w:val="a"/>
-    <w:link w:val="30"/>
+    <w:basedOn w:val="Normal"/>
+    <w:next w:val="Normal"/>
+    <w:link w:val="Heading3Char"/>
     <w:uiPriority w:val="9"/>
     <w:semiHidden/>
     <w:unhideWhenUsed/>
@@ -12606,13 +12997,13 @@
       <w:szCs w:val="24"/>
     </w:rPr>
   </w:style>
-  <w:style w:type="character" w:default="1" w:styleId="a0">
+  <w:style w:type="character" w:default="1" w:styleId="DefaultParagraphFont">
     <w:name w:val="Default Paragraph Font"/>
     <w:uiPriority w:val="1"/>
     <w:semiHidden/>
     <w:unhideWhenUsed/>
   </w:style>
-  <w:style w:type="table" w:default="1" w:styleId="a1">
+  <w:style w:type="table" w:default="1" w:styleId="TableNormal">
     <w:name w:val="Normal Table"/>
     <w:uiPriority w:val="99"/>
     <w:semiHidden/>
@@ -12627,16 +13018,16 @@
       </w:tblCellMar>
     </w:tblPr>
   </w:style>
-  <w:style w:type="numbering" w:default="1" w:styleId="a2">
+  <w:style w:type="numbering" w:default="1" w:styleId="NoList">
     <w:name w:val="No List"/>
     <w:uiPriority w:val="99"/>
     <w:semiHidden/>
     <w:unhideWhenUsed/>
   </w:style>
-  <w:style w:type="character" w:customStyle="1" w:styleId="10">
-    <w:name w:val="Заголовок 1 Знак"/>
-    <w:basedOn w:val="a0"/>
-    <w:link w:val="1"/>
+  <w:style w:type="character" w:customStyle="1" w:styleId="Heading1Char">
+    <w:name w:val="Heading 1 Char"/>
+    <w:basedOn w:val="DefaultParagraphFont"/>
+    <w:link w:val="Heading1"/>
     <w:uiPriority w:val="9"/>
     <w:rsid w:val="00D80B45"/>
     <w:rPr>
@@ -12648,9 +13039,9 @@
       <w:szCs w:val="48"/>
     </w:rPr>
   </w:style>
-  <w:style w:type="paragraph" w:styleId="a3">
+  <w:style w:type="paragraph" w:styleId="NormalWeb">
     <w:name w:val="Normal (Web)"/>
-    <w:basedOn w:val="a"/>
+    <w:basedOn w:val="Normal"/>
     <w:uiPriority w:val="99"/>
     <w:semiHidden/>
     <w:unhideWhenUsed/>
@@ -12664,9 +13055,9 @@
       <w:szCs w:val="24"/>
     </w:rPr>
   </w:style>
-  <w:style w:type="character" w:styleId="a4">
+  <w:style w:type="character" w:styleId="Strong">
     <w:name w:val="Strong"/>
-    <w:basedOn w:val="a0"/>
+    <w:basedOn w:val="DefaultParagraphFont"/>
     <w:uiPriority w:val="22"/>
     <w:qFormat/>
     <w:rsid w:val="00D80B45"/>
@@ -12675,10 +13066,10 @@
       <w:bCs/>
     </w:rPr>
   </w:style>
-  <w:style w:type="character" w:customStyle="1" w:styleId="20">
-    <w:name w:val="Заголовок 2 Знак"/>
-    <w:basedOn w:val="a0"/>
-    <w:link w:val="2"/>
+  <w:style w:type="character" w:customStyle="1" w:styleId="Heading2Char">
+    <w:name w:val="Heading 2 Char"/>
+    <w:basedOn w:val="DefaultParagraphFont"/>
+    <w:link w:val="Heading2"/>
     <w:uiPriority w:val="9"/>
     <w:semiHidden/>
     <w:rsid w:val="008E12D7"/>
@@ -12689,9 +13080,9 @@
       <w:szCs w:val="26"/>
     </w:rPr>
   </w:style>
-  <w:style w:type="character" w:styleId="a5">
+  <w:style w:type="character" w:styleId="Emphasis">
     <w:name w:val="Emphasis"/>
-    <w:basedOn w:val="a0"/>
+    <w:basedOn w:val="DefaultParagraphFont"/>
     <w:uiPriority w:val="20"/>
     <w:qFormat/>
     <w:rsid w:val="008E12D7"/>
@@ -12700,7 +13091,7 @@
       <w:iCs/>
     </w:rPr>
   </w:style>
-  <w:style w:type="paragraph" w:styleId="a6">
+  <w:style w:type="paragraph" w:styleId="NoSpacing">
     <w:name w:val="No Spacing"/>
     <w:uiPriority w:val="1"/>
     <w:qFormat/>
@@ -12711,12 +13102,12 @@
   </w:style>
   <w:style w:type="character" w:customStyle="1" w:styleId="whitespace-normal">
     <w:name w:val="whitespace-normal"/>
-    <w:basedOn w:val="a0"/>
+    <w:basedOn w:val="DefaultParagraphFont"/>
     <w:rsid w:val="001857BC"/>
   </w:style>
-  <w:style w:type="character" w:styleId="a7">
+  <w:style w:type="character" w:styleId="Hyperlink">
     <w:name w:val="Hyperlink"/>
-    <w:basedOn w:val="a0"/>
+    <w:basedOn w:val="DefaultParagraphFont"/>
     <w:uiPriority w:val="99"/>
     <w:semiHidden/>
     <w:unhideWhenUsed/>
@@ -12726,10 +13117,10 @@
       <w:u w:val="single"/>
     </w:rPr>
   </w:style>
-  <w:style w:type="character" w:customStyle="1" w:styleId="30">
-    <w:name w:val="Заголовок 3 Знак"/>
-    <w:basedOn w:val="a0"/>
-    <w:link w:val="3"/>
+  <w:style w:type="character" w:customStyle="1" w:styleId="Heading3Char">
+    <w:name w:val="Heading 3 Char"/>
+    <w:basedOn w:val="DefaultParagraphFont"/>
+    <w:link w:val="Heading3"/>
     <w:uiPriority w:val="9"/>
     <w:semiHidden/>
     <w:rsid w:val="0064290B"/>
@@ -12740,9 +13131,9 @@
       <w:szCs w:val="24"/>
     </w:rPr>
   </w:style>
-  <w:style w:type="paragraph" w:styleId="a8">
+  <w:style w:type="paragraph" w:styleId="ListParagraph">
     <w:name w:val="List Paragraph"/>
-    <w:basedOn w:val="a"/>
+    <w:basedOn w:val="Normal"/>
     <w:uiPriority w:val="34"/>
     <w:qFormat/>
     <w:rsid w:val="00BB10E7"/>
@@ -12750,6 +13141,40 @@
       <w:ind w:left="720"/>
       <w:contextualSpacing/>
     </w:pPr>
+  </w:style>
+  <w:style w:type="paragraph" w:styleId="Title">
+    <w:name w:val="Title"/>
+    <w:basedOn w:val="Normal"/>
+    <w:next w:val="Normal"/>
+    <w:link w:val="TitleChar"/>
+    <w:uiPriority w:val="10"/>
+    <w:qFormat/>
+    <w:rsid w:val="004F40AC"/>
+    <w:pPr>
+      <w:spacing w:after="0" w:line="240" w:lineRule="auto"/>
+      <w:contextualSpacing/>
+    </w:pPr>
+    <w:rPr>
+      <w:rFonts w:asciiTheme="majorHAnsi" w:eastAsiaTheme="majorEastAsia" w:hAnsiTheme="majorHAnsi" w:cstheme="majorBidi"/>
+      <w:spacing w:val="-10"/>
+      <w:kern w:val="28"/>
+      <w:sz w:val="56"/>
+      <w:szCs w:val="56"/>
+    </w:rPr>
+  </w:style>
+  <w:style w:type="character" w:customStyle="1" w:styleId="TitleChar">
+    <w:name w:val="Title Char"/>
+    <w:basedOn w:val="DefaultParagraphFont"/>
+    <w:link w:val="Title"/>
+    <w:uiPriority w:val="10"/>
+    <w:rsid w:val="004F40AC"/>
+    <w:rPr>
+      <w:rFonts w:asciiTheme="majorHAnsi" w:eastAsiaTheme="majorEastAsia" w:hAnsiTheme="majorHAnsi" w:cstheme="majorBidi"/>
+      <w:spacing w:val="-10"/>
+      <w:kern w:val="28"/>
+      <w:sz w:val="56"/>
+      <w:szCs w:val="56"/>
+    </w:rPr>
   </w:style>
 </w:styles>
 </file>

</xml_diff>